<commit_message>
block suspended users and update docs
Co-Authored-By: Claude Opus 5.5 <noreply@anthropic.com>
Claude-Session: https://claude.ai/code/session_019fKBjUjBqb8QnHYe4A7h5k
</commit_message>
<xml_diff>
--- a/docs/CityShield_Project_Documentation.docx
+++ b/docs/CityShield_Project_Documentation.docx
@@ -278,7 +278,7 @@
                 <w:sz w:val="20"/>
                 <w:szCs w:val="20"/>
               </w:rPr>
-              <w:t xml:space="preserve"> for ₹1,00,000 and a notification. A claims officer approves it, a </w:t>
+              <w:t xml:space="preserve"> for ₹1,00,000 and a notification. A claims officer approves it and the </w:t>
             </w:r>
             <w:r>
               <w:rPr>
@@ -287,14 +287,14 @@
                 <w:sz w:val="20"/>
                 <w:szCs w:val="20"/>
               </w:rPr>
-              <w:t xml:space="preserve">payout</w:t>
+              <w:t xml:space="preserve">payout is paid automatically</w:t>
             </w:r>
             <w:r>
               <w:rPr>
                 <w:sz w:val="20"/>
                 <w:szCs w:val="20"/>
               </w:rPr>
-              <w:t xml:space="preserve"> is created, the admin processes it, and Ravi receives the money and a receipt.</w:t>
+              <w:t xml:space="preserve"> — the claim is settled, and Ravi receives the money and a receipt. No admin step is needed.</w:t>
             </w:r>
           </w:p>
         </w:tc>
@@ -410,7 +410,27 @@
         <w:t xml:space="preserve">Current measurement</w:t>
       </w:r>
       <w:r>
-        <w:t xml:space="preserve"> — the latest value (e.g. rainfall) recorded by the admin for a product + zone.</w:t>
+        <w:t xml:space="preserve"> — the latest weather reading (e.g. rainfall). A demo feed adds normal readings every minute; the admin can set a value in the </w:t>
+      </w:r>
+      <w:r>
+        <w:rPr>
+          <w:b/>
+          <w:bCs/>
+        </w:rPr>
+        <w:t xml:space="preserve">Measurement details</w:t>
+      </w:r>
+      <w:r>
+        <w:t xml:space="preserve"> panel or test one product in the </w:t>
+      </w:r>
+      <w:r>
+        <w:rPr>
+          <w:b/>
+          <w:bCs/>
+        </w:rPr>
+        <w:t xml:space="preserve">Trigger simulator</w:t>
+      </w:r>
+      <w:r>
+        <w:t xml:space="preserve">.</w:t>
       </w:r>
     </w:p>
     <w:p>
@@ -504,7 +524,17 @@
         <w:t xml:space="preserve">Payout</w:t>
       </w:r>
       <w:r>
-        <w:t xml:space="preserve"> — money sent to the customer after a claims officer approves the claim.</w:t>
+        <w:t xml:space="preserve"> — money sent to the customer </w:t>
+      </w:r>
+      <w:r>
+        <w:rPr>
+          <w:b/>
+          <w:bCs/>
+        </w:rPr>
+        <w:t xml:space="preserve">automatically</w:t>
+      </w:r>
+      <w:r>
+        <w:t xml:space="preserve"> as soon as a claims officer approves the claim.</w:t>
       </w:r>
     </w:p>
     <w:p>
@@ -921,7 +951,7 @@
                 <w:sz w:val="19"/>
                 <w:szCs w:val="19"/>
               </w:rPr>
-              <w:t xml:space="preserve">Manage products, thresholds, zones, perils, pricing rules, users; record measurements; process payouts; view everything and the audit log</w:t>
+              <w:t xml:space="preserve">Manage products, thresholds, zones (weather alerts, exposure caps), perils, pricing rules, users; set live readings and run the trigger simulator; view everything and the audit log</w:t>
             </w:r>
           </w:p>
         </w:tc>
@@ -2915,7 +2945,7 @@
                 <w:sz w:val="19"/>
                 <w:szCs w:val="19"/>
               </w:rPr>
-              <w:t xml:space="preserve">Zones, perils, trigger definitions, current measurements, trigger events, demo feed</w:t>
+              <w:t xml:space="preserve">Zones (alerts, caps), perils, trigger definitions, live readings, trigger simulator, trigger events, demo feed</w:t>
             </w:r>
           </w:p>
         </w:tc>
@@ -5591,7 +5621,7 @@
                 <w:sz w:val="19"/>
                 <w:szCs w:val="19"/>
               </w:rPr>
-              <w:t xml:space="preserve">Validates password, blocks disabled accounts, records session (device), returns access + refresh token</w:t>
+              <w:t xml:space="preserve">Validates password, blocks disabled accounts and profiles that are SUSPENDED or INACTIVE, records session (device), returns access + refresh token</w:t>
             </w:r>
           </w:p>
         </w:tc>
@@ -6381,7 +6411,17 @@
         <w:spacing w:after="80"/>
       </w:pPr>
       <w:r>
-        <w:t xml:space="preserve">Product Service validates: product ACTIVE, sum insured and term inside limits, no other PENDING application for the same product.</w:t>
+        <w:t xml:space="preserve">Product Service validates: product ACTIVE, sum insured and term inside limits, no other PENDING application for the same product, and the </w:t>
+      </w:r>
+      <w:r>
+        <w:rPr>
+          <w:b/>
+          <w:bCs/>
+        </w:rPr>
+        <w:t xml:space="preserve">zone is open for sales</w:t>
+      </w:r>
+      <w:r>
+        <w:t xml:space="preserve"> — no weather alert and the zone exposure cap not exceeded (Journey 13).</w:t>
       </w:r>
     </w:p>
     <w:p>
@@ -6670,7 +6710,7 @@
         <w:t xml:space="preserve">PUT /api/policies/{id}/approve</w:t>
       </w:r>
       <w:r>
-        <w:t xml:space="preserve">: status </w:t>
+        <w:t xml:space="preserve">: the zone checks run again (alert / cap), then status </w:t>
       </w:r>
       <w:r>
         <w:rPr>
@@ -7146,10 +7186,42 @@
           <w:b/>
           <w:bCs/>
         </w:rPr>
-        <w:t xml:space="preserve">Admin → Current Measurements</w:t>
-      </w:r>
-      <w:r>
-        <w:t xml:space="preserve">. One card per active product shows the product rule and zone selector. A “use matching value” helper fills a value that crosses the threshold.</w:t>
+        <w:t xml:space="preserve">Admin → Trigger simulator</w:t>
+      </w:r>
+      <w:r>
+        <w:t xml:space="preserve"> (</w:t>
+      </w:r>
+      <w:r>
+        <w:rPr>
+          <w:rFonts w:ascii="Consolas" w:cs="Consolas" w:eastAsia="Consolas" w:hAnsi="Consolas"/>
+          <w:color w:val="9A3412"/>
+          <w:sz w:val="19"/>
+          <w:szCs w:val="19"/>
+        </w:rPr>
+        <w:t xml:space="preserve">/admin/current-measurements</w:t>
+      </w:r>
+      <w:r>
+        <w:t xml:space="preserve">). One card per active product shows the product rule and zone selector. </w:t>
+      </w:r>
+      <w:r>
+        <w:rPr>
+          <w:b/>
+          <w:bCs/>
+        </w:rPr>
+        <w:t xml:space="preserve">Fill in a value that triggers</w:t>
+      </w:r>
+      <w:r>
+        <w:t xml:space="preserve"> puts in a value that just crosses the threshold, and </w:t>
+      </w:r>
+      <w:r>
+        <w:rPr>
+          <w:b/>
+          <w:bCs/>
+        </w:rPr>
+        <w:t xml:space="preserve">Last simulated value</w:t>
+      </w:r>
+      <w:r>
+        <w:t xml:space="preserve"> shows the last value tested.</w:t>
       </w:r>
     </w:p>
     <w:p>
@@ -7172,7 +7244,17 @@
         <w:t xml:space="preserve">170</w:t>
       </w:r>
       <w:r>
-        <w:t xml:space="preserve"> (mm) and submits → </w:t>
+        <w:t xml:space="preserve"> (mm) and clicks </w:t>
+      </w:r>
+      <w:r>
+        <w:rPr>
+          <w:b/>
+          <w:bCs/>
+        </w:rPr>
+        <w:t xml:space="preserve">Simulate reading</w:t>
+      </w:r>
+      <w:r>
+        <w:t xml:space="preserve"> → </w:t>
       </w:r>
       <w:r>
         <w:rPr>
@@ -7332,7 +7414,24 @@
         <w:spacing w:after="80"/>
       </w:pPr>
       <w:r>
-        <w:t xml:space="preserve">If no policy matches → response “did not match any active policy trigger”. Nothing else is created.</w:t>
+        <w:rPr>
+          <w:b/>
+          <w:bCs/>
+        </w:rPr>
+        <w:t xml:space="preserve">Payment check</w:t>
+      </w:r>
+      <w:r>
+        <w:t xml:space="preserve"> — policies whose premium is </w:t>
+      </w:r>
+      <w:r>
+        <w:rPr>
+          <w:b/>
+          <w:bCs/>
+        </w:rPr>
+        <w:t xml:space="preserve">not paid</w:t>
+      </w:r>
+      <w:r>
+        <w:t xml:space="preserve"> are skipped and counted as “Skipped (premium unpaid)”. Only paid policies continue.</w:t>
       </w:r>
     </w:p>
     <w:p>
@@ -7345,39 +7444,7 @@
         <w:spacing w:after="80"/>
       </w:pPr>
       <w:r>
-        <w:t xml:space="preserve">If ≥ 1 policy matches → a </w:t>
-      </w:r>
-      <w:r>
-        <w:rPr>
-          <w:b/>
-          <w:bCs/>
-        </w:rPr>
-        <w:t xml:space="preserve">Trigger Event</w:t>
-      </w:r>
-      <w:r>
-        <w:t xml:space="preserve"> </w:t>
-      </w:r>
-      <w:r>
-        <w:rPr>
-          <w:rFonts w:ascii="Consolas" w:cs="Consolas" w:eastAsia="Consolas" w:hAnsi="Consolas"/>
-          <w:color w:val="9A3412"/>
-          <w:sz w:val="19"/>
-          <w:szCs w:val="19"/>
-        </w:rPr>
-        <w:t xml:space="preserve">TEV-&lt;uuid&gt;</w:t>
-      </w:r>
-      <w:r>
-        <w:t xml:space="preserve"> is saved with status </w:t>
-      </w:r>
-      <w:r>
-        <w:rPr>
-          <w:b/>
-          <w:bCs/>
-        </w:rPr>
-        <w:t xml:space="preserve">VERIFIED</w:t>
-      </w:r>
-      <w:r>
-        <w:t xml:space="preserve">, linked to the trigger definition and peril.</w:t>
+        <w:t xml:space="preserve">If no policy matches → response “did not match any active policy trigger”. Nothing else is created.</w:t>
       </w:r>
     </w:p>
     <w:p>
@@ -7390,7 +7457,17 @@
         <w:spacing w:after="80"/>
       </w:pPr>
       <w:r>
-        <w:t xml:space="preserve">Trigger Service calls Claims Service </w:t>
+        <w:t xml:space="preserve">If ≥ 1 paid policy matches → a </w:t>
+      </w:r>
+      <w:r>
+        <w:rPr>
+          <w:b/>
+          <w:bCs/>
+        </w:rPr>
+        <w:t xml:space="preserve">Trigger Event</w:t>
+      </w:r>
+      <w:r>
+        <w:t xml:space="preserve"> </w:t>
       </w:r>
       <w:r>
         <w:rPr>
@@ -7399,10 +7476,30 @@
           <w:sz w:val="19"/>
           <w:szCs w:val="19"/>
         </w:rPr>
-        <w:t xml:space="preserve">POST /internal/claims/from-trigger-event</w:t>
-      </w:r>
-      <w:r>
-        <w:t xml:space="preserve"> with the matched policies.</w:t>
+        <w:t xml:space="preserve">TEV-&lt;uuid&gt;</w:t>
+      </w:r>
+      <w:r>
+        <w:t xml:space="preserve"> is saved with status </w:t>
+      </w:r>
+      <w:r>
+        <w:rPr>
+          <w:b/>
+          <w:bCs/>
+        </w:rPr>
+        <w:t xml:space="preserve">VERIFIED</w:t>
+      </w:r>
+      <w:r>
+        <w:t xml:space="preserve">, linked to the trigger definition and peril, together with the </w:t>
+      </w:r>
+      <w:r>
+        <w:rPr>
+          <w:b/>
+          <w:bCs/>
+        </w:rPr>
+        <w:t xml:space="preserve">event time window</w:t>
+      </w:r>
+      <w:r>
+        <w:t xml:space="preserve"> (window start = now − observation window hours, window end = now).</w:t>
       </w:r>
     </w:p>
     <w:p>
@@ -7415,17 +7512,7 @@
         <w:spacing w:after="80"/>
       </w:pPr>
       <w:r>
-        <w:t xml:space="preserve">Claims Service creates </w:t>
-      </w:r>
-      <w:r>
-        <w:rPr>
-          <w:b/>
-          <w:bCs/>
-        </w:rPr>
-        <w:t xml:space="preserve">one claim per policy</w:t>
-      </w:r>
-      <w:r>
-        <w:t xml:space="preserve"> (skips if a claim for the same policy + event already exists): number </w:t>
+        <w:t xml:space="preserve">Trigger Service calls Claims Service </w:t>
       </w:r>
       <w:r>
         <w:rPr>
@@ -7434,40 +7521,10 @@
           <w:sz w:val="19"/>
           <w:szCs w:val="19"/>
         </w:rPr>
-        <w:t xml:space="preserve">CLM-2026-XXXXXXXX</w:t>
-      </w:r>
-      <w:r>
-        <w:t xml:space="preserve">, status </w:t>
-      </w:r>
-      <w:r>
-        <w:rPr>
-          <w:b/>
-          <w:bCs/>
-        </w:rPr>
-        <w:t xml:space="preserve">SUBMITTED</w:t>
-      </w:r>
-      <w:r>
-        <w:t xml:space="preserve">, source </w:t>
-      </w:r>
-      <w:r>
-        <w:rPr>
-          <w:b/>
-          <w:bCs/>
-        </w:rPr>
-        <w:t xml:space="preserve">AUTO_TRIGGERED</w:t>
-      </w:r>
-      <w:r>
-        <w:t xml:space="preserve">, claimed amount = </w:t>
-      </w:r>
-      <w:r>
-        <w:rPr>
-          <w:b/>
-          <w:bCs/>
-        </w:rPr>
-        <w:t xml:space="preserve">sum insured</w:t>
-      </w:r>
-      <w:r>
-        <w:t xml:space="preserve">, with observed value, threshold, operator and measurement stored on the claim. Timeline entry written.</w:t>
+        <w:t xml:space="preserve">POST /internal/claims/from-trigger-event</w:t>
+      </w:r>
+      <w:r>
+        <w:t xml:space="preserve"> with the matched policies.</w:t>
       </w:r>
     </w:p>
     <w:p>
@@ -7480,7 +7537,17 @@
         <w:spacing w:after="80"/>
       </w:pPr>
       <w:r>
-        <w:t xml:space="preserve">Notifications: customer gets “Automatic parametric claim created”; claims officers get “Claim pending review”. Audit: </w:t>
+        <w:t xml:space="preserve">Claims Service creates </w:t>
+      </w:r>
+      <w:r>
+        <w:rPr>
+          <w:b/>
+          <w:bCs/>
+        </w:rPr>
+        <w:t xml:space="preserve">one claim per policy</w:t>
+      </w:r>
+      <w:r>
+        <w:t xml:space="preserve"> (skips if a claim for the same policy + event already exists): number </w:t>
       </w:r>
       <w:r>
         <w:rPr>
@@ -7489,10 +7556,40 @@
           <w:sz w:val="19"/>
           <w:szCs w:val="19"/>
         </w:rPr>
-        <w:t xml:space="preserve">MEASUREMENT_RECORDED</w:t>
-      </w:r>
-      <w:r>
-        <w:t xml:space="preserve">.</w:t>
+        <w:t xml:space="preserve">CLM-2026-XXXXXXXX</w:t>
+      </w:r>
+      <w:r>
+        <w:t xml:space="preserve">, status </w:t>
+      </w:r>
+      <w:r>
+        <w:rPr>
+          <w:b/>
+          <w:bCs/>
+        </w:rPr>
+        <w:t xml:space="preserve">SUBMITTED</w:t>
+      </w:r>
+      <w:r>
+        <w:t xml:space="preserve">, source </w:t>
+      </w:r>
+      <w:r>
+        <w:rPr>
+          <w:b/>
+          <w:bCs/>
+        </w:rPr>
+        <w:t xml:space="preserve">AUTO_TRIGGERED</w:t>
+      </w:r>
+      <w:r>
+        <w:t xml:space="preserve">, claimed amount = </w:t>
+      </w:r>
+      <w:r>
+        <w:rPr>
+          <w:b/>
+          <w:bCs/>
+        </w:rPr>
+        <w:t xml:space="preserve">sum insured</w:t>
+      </w:r>
+      <w:r>
+        <w:t xml:space="preserve">, with observed value, threshold, operator, measurement and event window stored on the claim. Timeline entry written.</w:t>
       </w:r>
     </w:p>
     <w:p>
@@ -7505,7 +7602,32 @@
         <w:spacing w:after="80"/>
       </w:pPr>
       <w:r>
-        <w:t xml:space="preserve">The result panel shows: current value, threshold, active policies checked, policies matched, event reference, claims created, notifications stored.</w:t>
+        <w:t xml:space="preserve">Notifications: customer gets “Automatic parametric claim created”; claims officers get “Claim pending review”. Audit: </w:t>
+      </w:r>
+      <w:r>
+        <w:rPr>
+          <w:rFonts w:ascii="Consolas" w:cs="Consolas" w:eastAsia="Consolas" w:hAnsi="Consolas"/>
+          <w:color w:val="9A3412"/>
+          <w:sz w:val="19"/>
+          <w:szCs w:val="19"/>
+        </w:rPr>
+        <w:t xml:space="preserve">MEASUREMENT_RECORDED</w:t>
+      </w:r>
+      <w:r>
+        <w:t xml:space="preserve">.</w:t>
+      </w:r>
+    </w:p>
+    <w:p>
+      <w:pPr>
+        <w:pStyle w:val="ListParagraph"/>
+        <w:numPr>
+          <w:ilvl w:val="0"/>
+          <w:numId w:val="8"/>
+        </w:numPr>
+        <w:spacing w:after="80"/>
+      </w:pPr>
+      <w:r>
+        <w:t xml:space="preserve">The result panel shows: active policies checked, policies matched, skipped (premium unpaid), automatic claims and notifications stored.</w:t>
       </w:r>
     </w:p>
     <w:tbl>
@@ -7674,7 +7796,7 @@
                 <w:sz w:val="20"/>
                 <w:szCs w:val="20"/>
               </w:rPr>
-              <w:t xml:space="preserve">Current value 170 mm | Product threshold 150 mm | Active policies checked: 1 | Matched: 1</w:t>
+              <w:t xml:space="preserve">Current value 170 mm | Product threshold 150 mm | Active policies checked: 1 | Matched: 1 | Skipped (unpaid): 0</w:t>
             </w:r>
           </w:p>
           <w:p>
@@ -7939,17 +8061,27 @@
         <w:t xml:space="preserve">PO-…</w:t>
       </w:r>
       <w:r>
-        <w:t xml:space="preserve"> is created automatically with status </w:t>
+        <w:t xml:space="preserve"> is created </w:t>
       </w:r>
       <w:r>
         <w:rPr>
           <w:b/>
           <w:bCs/>
         </w:rPr>
-        <w:t xml:space="preserve">PENDING</w:t>
-      </w:r>
-      <w:r>
-        <w:t xml:space="preserve"> for the approved amount (one payout per claim).</w:t>
+        <w:t xml:space="preserve">and paid immediately</w:t>
+      </w:r>
+      <w:r>
+        <w:t xml:space="preserve"> for the approved amount (one payout per claim). The claim becomes </w:t>
+      </w:r>
+      <w:r>
+        <w:rPr>
+          <w:b/>
+          <w:bCs/>
+        </w:rPr>
+        <w:t xml:space="preserve">SETTLED</w:t>
+      </w:r>
+      <w:r>
+        <w:t xml:space="preserve"> and the officer sees it as settled straight away (Journey 8).</w:t>
       </w:r>
     </w:p>
     <w:p>
@@ -8085,7 +8217,23 @@
                 <w:sz w:val="20"/>
                 <w:szCs w:val="20"/>
               </w:rPr>
-              <w:t xml:space="preserve">Shiva starts review of CLM-2026-A1B2C3D4 and approves ₹1,00,000 → payout PO-… (PENDING, ₹1,00,000) is created for Ravi.</w:t>
+              <w:t xml:space="preserve">Shiva starts review of CLM-2026-A1B2C3D4 and approves ₹1,00,000 → payout PO-… is paid to Ravi at once (transfer AUTO-…) and the claim shows </w:t>
+            </w:r>
+            <w:r>
+              <w:rPr>
+                <w:b/>
+                <w:bCs/>
+                <w:sz w:val="20"/>
+                <w:szCs w:val="20"/>
+              </w:rPr>
+              <w:t xml:space="preserve">SETTLED</w:t>
+            </w:r>
+            <w:r>
+              <w:rPr>
+                <w:sz w:val="20"/>
+                <w:szCs w:val="20"/>
+              </w:rPr>
+              <w:t xml:space="preserve">.</w:t>
             </w:r>
           </w:p>
         </w:tc>
@@ -8101,7 +8249,7 @@
         <w:pStyle w:val="Heading2"/>
       </w:pPr>
       <w:r>
-        <w:t xml:space="preserve">Journey 8 — Payout processing (PENDING → PROCESSING → SUCCESS / FAILED)</w:t>
+        <w:t xml:space="preserve">Journey 8 — Automatic payout (no admin step)</w:t>
       </w:r>
     </w:p>
     <w:p>
@@ -8114,17 +8262,7 @@
         <w:spacing w:after="80"/>
       </w:pPr>
       <w:r>
-        <w:t xml:space="preserve">Admin opens </w:t>
-      </w:r>
-      <w:r>
-        <w:rPr>
-          <w:b/>
-          <w:bCs/>
-        </w:rPr>
-        <w:t xml:space="preserve">/admin/payouts</w:t>
-      </w:r>
-      <w:r>
-        <w:t xml:space="preserve"> (</w:t>
+        <w:t xml:space="preserve">When the claim is approved, Financial Service creates payout </w:t>
       </w:r>
       <w:r>
         <w:rPr>
@@ -8133,10 +8271,42 @@
           <w:sz w:val="19"/>
           <w:szCs w:val="19"/>
         </w:rPr>
-        <w:t xml:space="preserve">GET /api/financial/payouts/admin/all</w:t>
-      </w:r>
-      <w:r>
-        <w:t xml:space="preserve">).</w:t>
+        <w:t xml:space="preserve">PO-…</w:t>
+      </w:r>
+      <w:r>
+        <w:t xml:space="preserve"> for the approved amount and </w:t>
+      </w:r>
+      <w:r>
+        <w:rPr>
+          <w:b/>
+          <w:bCs/>
+        </w:rPr>
+        <w:t xml:space="preserve">pays it immediately</w:t>
+      </w:r>
+      <w:r>
+        <w:t xml:space="preserve"> (simulated bank transfer). Status goes straight to </w:t>
+      </w:r>
+      <w:r>
+        <w:rPr>
+          <w:b/>
+          <w:bCs/>
+        </w:rPr>
+        <w:t xml:space="preserve">SUCCESS</w:t>
+      </w:r>
+      <w:r>
+        <w:t xml:space="preserve"> with transfer reference </w:t>
+      </w:r>
+      <w:r>
+        <w:rPr>
+          <w:rFonts w:ascii="Consolas" w:cs="Consolas" w:eastAsia="Consolas" w:hAnsi="Consolas"/>
+          <w:color w:val="9A3412"/>
+          <w:sz w:val="19"/>
+          <w:szCs w:val="19"/>
+        </w:rPr>
+        <w:t xml:space="preserve">AUTO-…</w:t>
+      </w:r>
+      <w:r>
+        <w:t xml:space="preserve"> and the processed time.</w:t>
       </w:r>
     </w:p>
     <w:p>
@@ -8149,14 +8319,17 @@
         <w:spacing w:after="80"/>
       </w:pPr>
       <w:r>
+        <w:t xml:space="preserve">Then, automatically: the customer is notified “Payout processed”; the claim is </w:t>
+      </w:r>
+      <w:r>
         <w:rPr>
           <w:b/>
           <w:bCs/>
         </w:rPr>
-        <w:t xml:space="preserve">Process</w:t>
-      </w:r>
-      <w:r>
-        <w:t xml:space="preserve"> → </w:t>
+        <w:t xml:space="preserve">settled</w:t>
+      </w:r>
+      <w:r>
+        <w:t xml:space="preserve"> (</w:t>
       </w:r>
       <w:r>
         <w:rPr>
@@ -8165,20 +8338,20 @@
           <w:sz w:val="19"/>
           <w:szCs w:val="19"/>
         </w:rPr>
-        <w:t xml:space="preserve">PUT /api/financial/payouts/{id}/process</w:t>
-      </w:r>
-      <w:r>
-        <w:t xml:space="preserve"> → </w:t>
+        <w:t xml:space="preserve">PUT /internal/claims/{id}/settle</w:t>
+      </w:r>
+      <w:r>
+        <w:t xml:space="preserve">); Trigger Service marks the trigger event </w:t>
       </w:r>
       <w:r>
         <w:rPr>
           <w:b/>
           <w:bCs/>
         </w:rPr>
-        <w:t xml:space="preserve">PROCESSING</w:t>
-      </w:r>
-      <w:r>
-        <w:t xml:space="preserve">.</w:t>
+        <w:t xml:space="preserve">processed</w:t>
+      </w:r>
+      <w:r>
+        <w:t xml:space="preserve">; a ledger (financial transaction) row is written.</w:t>
       </w:r>
     </w:p>
     <w:p>
@@ -8191,31 +8364,14 @@
         <w:spacing w:after="80"/>
       </w:pPr>
       <w:r>
+        <w:t xml:space="preserve">These follow-up steps are best effort: if one fails (e.g. Claims Service is down), the payment still stands, the problem is logged, and the officer can use </w:t>
+      </w:r>
+      <w:r>
         <w:rPr>
           <w:b/>
           <w:bCs/>
         </w:rPr>
-        <w:t xml:space="preserve">Mark success</w:t>
-      </w:r>
-      <w:r>
-        <w:t xml:space="preserve"> (optional external bank reference) → </w:t>
-      </w:r>
-      <w:r>
-        <w:rPr>
-          <w:b/>
-          <w:bCs/>
-        </w:rPr>
-        <w:t xml:space="preserve">SUCCESS</w:t>
-      </w:r>
-      <w:r>
-        <w:t xml:space="preserve">. Customer notified “Payout processed”, ledger row written, and Trigger Service is told to mark the trigger event </w:t>
-      </w:r>
-      <w:r>
-        <w:rPr>
-          <w:b/>
-          <w:bCs/>
-        </w:rPr>
-        <w:t xml:space="preserve">processed</w:t>
+        <w:t xml:space="preserve">Mark as settled</w:t>
       </w:r>
       <w:r>
         <w:t xml:space="preserve">.</w:t>
@@ -8231,47 +8387,29 @@
         <w:spacing w:after="80"/>
       </w:pPr>
       <w:r>
-        <w:t xml:space="preserve">or </w:t>
+        <w:t xml:space="preserve">Admin → </w:t>
       </w:r>
       <w:r>
         <w:rPr>
           <w:b/>
           <w:bCs/>
         </w:rPr>
-        <w:t xml:space="preserve">Mark failed</w:t>
-      </w:r>
-      <w:r>
-        <w:t xml:space="preserve"> with a reason → </w:t>
+        <w:t xml:space="preserve">Payouts</w:t>
+      </w:r>
+      <w:r>
+        <w:t xml:space="preserve"> (</w:t>
       </w:r>
       <w:r>
         <w:rPr>
-          <w:b/>
-          <w:bCs/>
+          <w:rFonts w:ascii="Consolas" w:cs="Consolas" w:eastAsia="Consolas" w:hAnsi="Consolas"/>
+          <w:color w:val="9A3412"/>
+          <w:sz w:val="19"/>
+          <w:szCs w:val="19"/>
         </w:rPr>
-        <w:t xml:space="preserve">FAILED</w:t>
-      </w:r>
-      <w:r>
-        <w:t xml:space="preserve">. The </w:t>
-      </w:r>
-      <w:r>
-        <w:rPr>
-          <w:b/>
-          <w:bCs/>
-        </w:rPr>
-        <w:t xml:space="preserve">PayoutRetryScheduler</w:t>
-      </w:r>
-      <w:r>
-        <w:t xml:space="preserve"> (every 5 min) automatically retries failed payouts up to </w:t>
-      </w:r>
-      <w:r>
-        <w:rPr>
-          <w:b/>
-          <w:bCs/>
-        </w:rPr>
-        <w:t xml:space="preserve">3 times</w:t>
-      </w:r>
-      <w:r>
-        <w:t xml:space="preserve">; admin can also </w:t>
+        <w:t xml:space="preserve">GET /api/financial/payouts/admin/all</w:t>
+      </w:r>
+      <w:r>
+        <w:t xml:space="preserve">) is a read-only history with transfer reference and time. </w:t>
       </w:r>
       <w:r>
         <w:rPr>
@@ -8281,7 +8419,19 @@
         <w:t xml:space="preserve">Retry</w:t>
       </w:r>
       <w:r>
-        <w:t xml:space="preserve"> manually.</w:t>
+        <w:t xml:space="preserve"> appears only for an old payout that FAILED and pays it straight away (</w:t>
+      </w:r>
+      <w:r>
+        <w:rPr>
+          <w:rFonts w:ascii="Consolas" w:cs="Consolas" w:eastAsia="Consolas" w:hAnsi="Consolas"/>
+          <w:color w:val="9A3412"/>
+          <w:sz w:val="19"/>
+          <w:szCs w:val="19"/>
+        </w:rPr>
+        <w:t xml:space="preserve">PUT /api/financial/payouts/{id}/retry</w:t>
+      </w:r>
+      <w:r>
+        <w:t xml:space="preserve">).</w:t>
       </w:r>
     </w:p>
     <w:p>
@@ -8294,6 +8444,39 @@
         <w:spacing w:after="80"/>
       </w:pPr>
       <w:r>
+        <w:t xml:space="preserve">Safety net: the </w:t>
+      </w:r>
+      <w:r>
+        <w:rPr>
+          <w:b/>
+          <w:bCs/>
+        </w:rPr>
+        <w:t xml:space="preserve">PayoutRetryScheduler</w:t>
+      </w:r>
+      <w:r>
+        <w:t xml:space="preserve"> runs 30 s after start-up and then every 5 min — it pays any payout still PENDING/PROCESSING and retries FAILED ones up to </w:t>
+      </w:r>
+      <w:r>
+        <w:rPr>
+          <w:b/>
+          <w:bCs/>
+        </w:rPr>
+        <w:t xml:space="preserve">3 times</w:t>
+      </w:r>
+      <w:r>
+        <w:t xml:space="preserve">.</w:t>
+      </w:r>
+    </w:p>
+    <w:p>
+      <w:pPr>
+        <w:pStyle w:val="ListParagraph"/>
+        <w:numPr>
+          <w:ilvl w:val="0"/>
+          <w:numId w:val="10"/>
+        </w:numPr>
+        <w:spacing w:after="80"/>
+      </w:pPr>
+      <w:r>
         <w:t xml:space="preserve">Ravi sees the payout under </w:t>
       </w:r>
       <w:r>
@@ -8329,26 +8512,99 @@
         <w:t xml:space="preserve">).</w:t>
       </w:r>
     </w:p>
-    <w:p>
-      <w:pPr>
-        <w:spacing w:after="120"/>
-      </w:pPr>
-      <w:r>
-        <w:t xml:space="preserve">Note: the claims API also offers </w:t>
-      </w:r>
-      <w:r>
-        <w:rPr>
-          <w:rFonts w:ascii="Consolas" w:cs="Consolas" w:eastAsia="Consolas" w:hAnsi="Consolas"/>
-          <w:color w:val="9A3412"/>
-          <w:sz w:val="19"/>
-          <w:szCs w:val="19"/>
-        </w:rPr>
-        <w:t xml:space="preserve">PUT /api/claims/{id}/settle</w:t>
-      </w:r>
-      <w:r>
-        <w:t xml:space="preserve"> (APPROVED → SETTLED) to formally close a claim; it is available on the backend but not exposed as a button in the current UI.</w:t>
-      </w:r>
-    </w:p>
+    <w:tbl>
+      <w:tblPr>
+        <w:tblW w:type="dxa" w:w="9026"/>
+        <w:tblBorders>
+          <w:top w:val="single" w:color="auto" w:sz="4"/>
+          <w:left w:val="single" w:color="auto" w:sz="4"/>
+          <w:bottom w:val="single" w:color="auto" w:sz="4"/>
+          <w:right w:val="single" w:color="auto" w:sz="4"/>
+          <w:insideH w:val="single" w:color="auto" w:sz="4"/>
+          <w:insideV w:val="single" w:color="auto" w:sz="4"/>
+        </w:tblBorders>
+      </w:tblPr>
+      <w:tblGrid>
+        <w:gridCol w:w="9026"/>
+      </w:tblGrid>
+      <w:tr>
+        <w:tc>
+          <w:tcPr>
+            <w:tcW w:type="dxa" w:w="9026"/>
+            <w:tcBorders>
+              <w:top w:val="single" w:color="C9D3DF" w:sz="4"/>
+              <w:left w:val="single" w:color="1F4E79" w:sz="24"/>
+              <w:bottom w:val="single" w:color="C9D3DF" w:sz="4"/>
+              <w:right w:val="single" w:color="C9D3DF" w:sz="4"/>
+            </w:tcBorders>
+            <w:shd w:fill="EAF1F8" w:color="auto" w:val="clear"/>
+            <w:tcMar>
+              <w:top w:type="dxa" w:w="100"/>
+              <w:left w:type="dxa" w:w="200"/>
+              <w:bottom w:type="dxa" w:w="100"/>
+              <w:right w:type="dxa" w:w="160"/>
+            </w:tcMar>
+          </w:tcPr>
+          <w:p>
+            <w:pPr>
+              <w:spacing w:after="60"/>
+            </w:pPr>
+            <w:r>
+              <w:rPr>
+                <w:b/>
+                <w:bCs/>
+                <w:color w:val="1F4E79"/>
+              </w:rPr>
+              <w:t xml:space="preserve">Example</w:t>
+            </w:r>
+          </w:p>
+          <w:p>
+            <w:pPr>
+              <w:spacing w:after="40"/>
+            </w:pPr>
+            <w:r>
+              <w:rPr>
+                <w:sz w:val="20"/>
+                <w:szCs w:val="20"/>
+              </w:rPr>
+              <w:t xml:space="preserve">Shiva approves ₹1,00,000 at 10:15 → at 10:15 Ravi’s payout PO-… shows </w:t>
+            </w:r>
+            <w:r>
+              <w:rPr>
+                <w:b/>
+                <w:bCs/>
+                <w:sz w:val="20"/>
+                <w:szCs w:val="20"/>
+              </w:rPr>
+              <w:t xml:space="preserve">SUCCESS</w:t>
+            </w:r>
+            <w:r>
+              <w:rPr>
+                <w:sz w:val="20"/>
+                <w:szCs w:val="20"/>
+              </w:rPr>
+              <w:t xml:space="preserve">, transfer AUTO-3F9A1C…, the claim is </w:t>
+            </w:r>
+            <w:r>
+              <w:rPr>
+                <w:b/>
+                <w:bCs/>
+                <w:sz w:val="20"/>
+                <w:szCs w:val="20"/>
+              </w:rPr>
+              <w:t xml:space="preserve">SETTLED</w:t>
+            </w:r>
+            <w:r>
+              <w:rPr>
+                <w:sz w:val="20"/>
+                <w:szCs w:val="20"/>
+              </w:rPr>
+              <w:t xml:space="preserve"> and Ravi gets a notification.</w:t>
+            </w:r>
+          </w:p>
+        </w:tc>
+      </w:tr>
+    </w:tbl>
     <w:p>
       <w:pPr>
         <w:pStyle w:val="Heading2"/>
@@ -8426,7 +8682,17 @@
         <w:t xml:space="preserve">POST /api/claims</w:t>
       </w:r>
       <w:r>
-        <w:t xml:space="preserve">. The backend requires the confirmation and an evidence description, and blocks duplicates.</w:t>
+        <w:t xml:space="preserve">. The backend requires the confirmation and an evidence description, blocks duplicates, and refuses the claim if the policy’s </w:t>
+      </w:r>
+      <w:r>
+        <w:rPr>
+          <w:b/>
+          <w:bCs/>
+        </w:rPr>
+        <w:t xml:space="preserve">premium is not paid</w:t>
+      </w:r>
+      <w:r>
+        <w:t xml:space="preserve"> (“pay it before filing a claim”).</w:t>
       </w:r>
     </w:p>
     <w:p>
@@ -8531,7 +8797,7 @@
         <w:spacing w:after="80"/>
       </w:pPr>
       <w:r>
-        <w:t xml:space="preserve">Same review → approve → payout flow as Journey 7–8.</w:t>
+        <w:t xml:space="preserve">Same review → approve → automatic payout flow as Journey 7–8.</w:t>
       </w:r>
     </w:p>
     <w:p>
@@ -9392,7 +9658,7 @@
         <w:t xml:space="preserve">/admin/notifications</w:t>
       </w:r>
       <w:r>
-        <w:t xml:space="preserve"> (all, failed, batch send, templates) and </w:t>
+        <w:t xml:space="preserve"> (every notification, with search, mark read and delete) and </w:t>
       </w:r>
       <w:r>
         <w:rPr>
@@ -9402,7 +9668,7 @@
         <w:t xml:space="preserve">/admin/audit</w:t>
       </w:r>
       <w:r>
-        <w:t xml:space="preserve"> (full audit log). Every user has </w:t>
+        <w:t xml:space="preserve"> (full audit log with before → after values). Templates, failed deliveries and batch send are available through the API. Every user has </w:t>
       </w:r>
       <w:r>
         <w:rPr>
@@ -9425,6 +9691,656 @@
       </w:r>
       <w:r>
         <w:t xml:space="preserve">).</w:t>
+      </w:r>
+    </w:p>
+    <w:p>
+      <w:pPr>
+        <w:pStyle w:val="Heading2"/>
+      </w:pPr>
+      <w:r>
+        <w:t xml:space="preserve">Journey 13 — Zone sales controls: weather alert &amp; exposure cap</w:t>
+      </w:r>
+    </w:p>
+    <w:p>
+      <w:pPr>
+        <w:pStyle w:val="ListParagraph"/>
+        <w:numPr>
+          <w:ilvl w:val="0"/>
+          <w:numId w:val="2"/>
+        </w:numPr>
+        <w:spacing w:after="60"/>
+      </w:pPr>
+      <w:r>
+        <w:rPr>
+          <w:b/>
+          <w:bCs/>
+        </w:rPr>
+        <w:t xml:space="preserve">Weather alert</w:t>
+      </w:r>
+      <w:r>
+        <w:t xml:space="preserve"> — Admin → Zones → </w:t>
+      </w:r>
+      <w:r>
+        <w:rPr>
+          <w:b/>
+          <w:bCs/>
+        </w:rPr>
+        <w:t xml:space="preserve">Raise alert</w:t>
+      </w:r>
+      <w:r>
+        <w:t xml:space="preserve"> with a message (</w:t>
+      </w:r>
+      <w:r>
+        <w:rPr>
+          <w:rFonts w:ascii="Consolas" w:cs="Consolas" w:eastAsia="Consolas" w:hAnsi="Consolas"/>
+          <w:color w:val="9A3412"/>
+          <w:sz w:val="19"/>
+          <w:szCs w:val="19"/>
+        </w:rPr>
+        <w:t xml:space="preserve">PUT /api/triggers/zones/{id}/alert</w:t>
+      </w:r>
+      <w:r>
+        <w:t xml:space="preserve">). While it is on, </w:t>
+      </w:r>
+      <w:r>
+        <w:rPr>
+          <w:b/>
+          <w:bCs/>
+        </w:rPr>
+        <w:t xml:space="preserve">no new policies can be sold or approved</w:t>
+      </w:r>
+      <w:r>
+        <w:t xml:space="preserve"> in that zone, so nobody can buy cover after a storm is announced. Existing policies stay covered. </w:t>
+      </w:r>
+      <w:r>
+        <w:rPr>
+          <w:b/>
+          <w:bCs/>
+        </w:rPr>
+        <w:t xml:space="preserve">Clear alert</w:t>
+      </w:r>
+      <w:r>
+        <w:t xml:space="preserve"> reopens sales.</w:t>
+      </w:r>
+    </w:p>
+    <w:p>
+      <w:pPr>
+        <w:pStyle w:val="ListParagraph"/>
+        <w:numPr>
+          <w:ilvl w:val="0"/>
+          <w:numId w:val="2"/>
+        </w:numPr>
+        <w:spacing w:after="60"/>
+      </w:pPr>
+      <w:r>
+        <w:rPr>
+          <w:b/>
+          <w:bCs/>
+        </w:rPr>
+        <w:t xml:space="preserve">Exposure cap</w:t>
+      </w:r>
+      <w:r>
+        <w:t xml:space="preserve"> — Admin → Zones → </w:t>
+      </w:r>
+      <w:r>
+        <w:rPr>
+          <w:b/>
+          <w:bCs/>
+        </w:rPr>
+        <w:t xml:space="preserve">Set cap</w:t>
+      </w:r>
+      <w:r>
+        <w:t xml:space="preserve"> (</w:t>
+      </w:r>
+      <w:r>
+        <w:rPr>
+          <w:rFonts w:ascii="Consolas" w:cs="Consolas" w:eastAsia="Consolas" w:hAnsi="Consolas"/>
+          <w:color w:val="9A3412"/>
+          <w:sz w:val="19"/>
+          <w:szCs w:val="19"/>
+        </w:rPr>
+        <w:t xml:space="preserve">PUT /api/triggers/zones/{id}/exposure-cap</w:t>
+      </w:r>
+      <w:r>
+        <w:t xml:space="preserve">): the maximum total sum insured of ACTIVE + PENDING policies in the zone. A new application or approval that would go over the cap is refused with the remaining room. No cap = no limit.</w:t>
+      </w:r>
+    </w:p>
+    <w:p>
+      <w:pPr>
+        <w:pStyle w:val="ListParagraph"/>
+        <w:numPr>
+          <w:ilvl w:val="0"/>
+          <w:numId w:val="2"/>
+        </w:numPr>
+        <w:spacing w:after="60"/>
+      </w:pPr>
+      <w:r>
+        <w:rPr>
+          <w:b/>
+          <w:bCs/>
+        </w:rPr>
+        <w:t xml:space="preserve">Zone exposure page</w:t>
+      </w:r>
+      <w:r>
+        <w:t xml:space="preserve"> (</w:t>
+      </w:r>
+      <w:r>
+        <w:rPr>
+          <w:rFonts w:ascii="Consolas" w:cs="Consolas" w:eastAsia="Consolas" w:hAnsi="Consolas"/>
+          <w:color w:val="9A3412"/>
+          <w:sz w:val="19"/>
+          <w:szCs w:val="19"/>
+        </w:rPr>
+        <w:t xml:space="preserve">/admin/zone-exposure</w:t>
+      </w:r>
+      <w:r>
+        <w:t xml:space="preserve">, </w:t>
+      </w:r>
+      <w:r>
+        <w:rPr>
+          <w:rFonts w:ascii="Consolas" w:cs="Consolas" w:eastAsia="Consolas" w:hAnsi="Consolas"/>
+          <w:color w:val="9A3412"/>
+          <w:sz w:val="19"/>
+          <w:szCs w:val="19"/>
+        </w:rPr>
+        <w:t xml:space="preserve">GET /api/policies/admin/zone-exposure</w:t>
+      </w:r>
+      <w:r>
+        <w:t xml:space="preserve">) — cover used, utilisation %, active / pending policies and whether sales are open, per zone.</w:t>
+      </w:r>
+    </w:p>
+    <w:tbl>
+      <w:tblPr>
+        <w:tblW w:type="dxa" w:w="9026"/>
+        <w:tblBorders>
+          <w:top w:val="single" w:color="auto" w:sz="4"/>
+          <w:left w:val="single" w:color="auto" w:sz="4"/>
+          <w:bottom w:val="single" w:color="auto" w:sz="4"/>
+          <w:right w:val="single" w:color="auto" w:sz="4"/>
+          <w:insideH w:val="single" w:color="auto" w:sz="4"/>
+          <w:insideV w:val="single" w:color="auto" w:sz="4"/>
+        </w:tblBorders>
+      </w:tblPr>
+      <w:tblGrid>
+        <w:gridCol w:w="9026"/>
+      </w:tblGrid>
+      <w:tr>
+        <w:tc>
+          <w:tcPr>
+            <w:tcW w:type="dxa" w:w="9026"/>
+            <w:tcBorders>
+              <w:top w:val="single" w:color="C9D3DF" w:sz="4"/>
+              <w:left w:val="single" w:color="1F4E79" w:sz="24"/>
+              <w:bottom w:val="single" w:color="C9D3DF" w:sz="4"/>
+              <w:right w:val="single" w:color="C9D3DF" w:sz="4"/>
+            </w:tcBorders>
+            <w:shd w:fill="EAF1F8" w:color="auto" w:val="clear"/>
+            <w:tcMar>
+              <w:top w:type="dxa" w:w="100"/>
+              <w:left w:type="dxa" w:w="200"/>
+              <w:bottom w:type="dxa" w:w="100"/>
+              <w:right w:type="dxa" w:w="160"/>
+            </w:tcMar>
+          </w:tcPr>
+          <w:p>
+            <w:pPr>
+              <w:spacing w:after="60"/>
+            </w:pPr>
+            <w:r>
+              <w:rPr>
+                <w:b/>
+                <w:bCs/>
+                <w:color w:val="1F4E79"/>
+              </w:rPr>
+              <w:t xml:space="preserve">Example</w:t>
+            </w:r>
+          </w:p>
+          <w:p>
+            <w:pPr>
+              <w:spacing w:after="40"/>
+            </w:pPr>
+            <w:r>
+              <w:rPr>
+                <w:sz w:val="20"/>
+                <w:szCs w:val="20"/>
+              </w:rPr>
+              <w:t xml:space="preserve">Cap ₹5,00,000, already ₹4,00,000 used (₹3,00,000 active + ₹1,00,000 pending). A ₹1,50,000 application is refused: only ₹1,00,000 of cover is still available. Admin raises “Cyclone warning” on Chennai → every new application there is refused until the alert is cleared.</w:t>
+            </w:r>
+          </w:p>
+        </w:tc>
+      </w:tr>
+    </w:tbl>
+    <w:p>
+      <w:pPr>
+        <w:spacing w:after="80"/>
+      </w:pPr>
+    </w:p>
+    <w:p>
+      <w:pPr>
+        <w:pStyle w:val="Heading2"/>
+      </w:pPr>
+      <w:r>
+        <w:t xml:space="preserve">Journey 14 — Live measurement panel &amp; “Update value”</w:t>
+      </w:r>
+    </w:p>
+    <w:p>
+      <w:pPr>
+        <w:pStyle w:val="ListParagraph"/>
+        <w:numPr>
+          <w:ilvl w:val="0"/>
+          <w:numId w:val="13"/>
+        </w:numPr>
+        <w:spacing w:after="80"/>
+      </w:pPr>
+      <w:r>
+        <w:t xml:space="preserve">Anyone logged in clicks the </w:t>
+      </w:r>
+      <w:r>
+        <w:rPr>
+          <w:b/>
+          <w:bCs/>
+        </w:rPr>
+        <w:t xml:space="preserve">gauge icon</w:t>
+      </w:r>
+      <w:r>
+        <w:t xml:space="preserve"> in the header → </w:t>
+      </w:r>
+      <w:r>
+        <w:rPr>
+          <w:b/>
+          <w:bCs/>
+        </w:rPr>
+        <w:t xml:space="preserve">Measurement details &amp; thresholds</w:t>
+      </w:r>
+      <w:r>
+        <w:t xml:space="preserve">. It refreshes every 10 s and shows: sensors reporting, products monitored, near trigger, triggered; one card per measurement with its own icon and the current value; each product’s threshold with a </w:t>
+      </w:r>
+      <w:r>
+        <w:rPr>
+          <w:b/>
+          <w:bCs/>
+        </w:rPr>
+        <w:t xml:space="preserve">progress bar</w:t>
+      </w:r>
+      <w:r>
+        <w:t xml:space="preserve"> (amber at ≥ 80 %, red when crossed).</w:t>
+      </w:r>
+    </w:p>
+    <w:p>
+      <w:pPr>
+        <w:pStyle w:val="ListParagraph"/>
+        <w:numPr>
+          <w:ilvl w:val="0"/>
+          <w:numId w:val="13"/>
+        </w:numPr>
+        <w:spacing w:after="80"/>
+      </w:pPr>
+      <w:r>
+        <w:t xml:space="preserve">Admin clicks </w:t>
+      </w:r>
+      <w:r>
+        <w:rPr>
+          <w:b/>
+          <w:bCs/>
+        </w:rPr>
+        <w:t xml:space="preserve">Update value</w:t>
+      </w:r>
+      <w:r>
+        <w:t xml:space="preserve"> on a card (e.g. Rainfall) and enters a new value → </w:t>
+      </w:r>
+      <w:r>
+        <w:rPr>
+          <w:rFonts w:ascii="Consolas" w:cs="Consolas" w:eastAsia="Consolas" w:hAnsi="Consolas"/>
+          <w:color w:val="9A3412"/>
+          <w:sz w:val="19"/>
+          <w:szCs w:val="19"/>
+        </w:rPr>
+        <w:t xml:space="preserve">PUT /api/triggers/measurements/current</w:t>
+      </w:r>
+      <w:r>
+        <w:t xml:space="preserve"> with </w:t>
+      </w:r>
+      <w:r>
+        <w:rPr>
+          <w:rFonts w:ascii="Consolas" w:cs="Consolas" w:eastAsia="Consolas" w:hAnsi="Consolas"/>
+          <w:color w:val="9A3412"/>
+          <w:sz w:val="19"/>
+          <w:szCs w:val="19"/>
+        </w:rPr>
+        <w:t xml:space="preserve">{ measurementType, value, productIds }</w:t>
+      </w:r>
+      <w:r>
+        <w:t xml:space="preserve">.</w:t>
+      </w:r>
+    </w:p>
+    <w:p>
+      <w:pPr>
+        <w:pStyle w:val="ListParagraph"/>
+        <w:numPr>
+          <w:ilvl w:val="0"/>
+          <w:numId w:val="13"/>
+        </w:numPr>
+        <w:spacing w:after="80"/>
+      </w:pPr>
+      <w:r>
+        <w:t xml:space="preserve">Trigger Service stores the value as a validated MANUAL reading in </w:t>
+      </w:r>
+      <w:r>
+        <w:rPr>
+          <w:b/>
+          <w:bCs/>
+        </w:rPr>
+        <w:t xml:space="preserve">every active zone</w:t>
+      </w:r>
+      <w:r>
+        <w:t xml:space="preserve">. The demo feed leaves it alone for </w:t>
+      </w:r>
+      <w:r>
+        <w:rPr>
+          <w:b/>
+          <w:bCs/>
+        </w:rPr>
+        <w:t xml:space="preserve">60 minutes</w:t>
+      </w:r>
+      <w:r>
+        <w:t xml:space="preserve"> (</w:t>
+      </w:r>
+      <w:r>
+        <w:rPr>
+          <w:rFonts w:ascii="Consolas" w:cs="Consolas" w:eastAsia="Consolas" w:hAnsi="Consolas"/>
+          <w:color w:val="9A3412"/>
+          <w:sz w:val="19"/>
+          <w:szCs w:val="19"/>
+        </w:rPr>
+        <w:t xml:space="preserve">DEMO_FEED_MANUAL_HOLD_MINUTES</w:t>
+      </w:r>
+      <w:r>
+        <w:t xml:space="preserve">), then normal readings resume. A </w:t>
+      </w:r>
+      <w:r>
+        <w:rPr>
+          <w:b/>
+          <w:bCs/>
+        </w:rPr>
+        <w:t xml:space="preserve">“Set by admin”</w:t>
+      </w:r>
+      <w:r>
+        <w:t xml:space="preserve"> tag is shown.</w:t>
+      </w:r>
+    </w:p>
+    <w:p>
+      <w:pPr>
+        <w:pStyle w:val="ListParagraph"/>
+        <w:numPr>
+          <w:ilvl w:val="0"/>
+          <w:numId w:val="13"/>
+        </w:numPr>
+        <w:spacing w:after="80"/>
+      </w:pPr>
+      <w:r>
+        <w:t xml:space="preserve">For every product of that measurement and every zone, the </w:t>
+      </w:r>
+      <w:r>
+        <w:rPr>
+          <w:b/>
+          <w:bCs/>
+        </w:rPr>
+        <w:t xml:space="preserve">same check as the Trigger simulator</w:t>
+      </w:r>
+      <w:r>
+        <w:t xml:space="preserve"> runs: paid policies whose locked threshold is crossed get automatic claims.</w:t>
+      </w:r>
+    </w:p>
+    <w:p>
+      <w:pPr>
+        <w:pStyle w:val="ListParagraph"/>
+        <w:numPr>
+          <w:ilvl w:val="0"/>
+          <w:numId w:val="13"/>
+        </w:numPr>
+        <w:spacing w:after="80"/>
+      </w:pPr>
+      <w:r>
+        <w:t xml:space="preserve">A toast reports the result, and the change is written to the audit log with old → new value.</w:t>
+      </w:r>
+    </w:p>
+    <w:tbl>
+      <w:tblPr>
+        <w:tblW w:type="dxa" w:w="9026"/>
+        <w:tblBorders>
+          <w:top w:val="single" w:color="auto" w:sz="4"/>
+          <w:left w:val="single" w:color="auto" w:sz="4"/>
+          <w:bottom w:val="single" w:color="auto" w:sz="4"/>
+          <w:right w:val="single" w:color="auto" w:sz="4"/>
+          <w:insideH w:val="single" w:color="auto" w:sz="4"/>
+          <w:insideV w:val="single" w:color="auto" w:sz="4"/>
+        </w:tblBorders>
+      </w:tblPr>
+      <w:tblGrid>
+        <w:gridCol w:w="9026"/>
+      </w:tblGrid>
+      <w:tr>
+        <w:tc>
+          <w:tcPr>
+            <w:tcW w:type="dxa" w:w="9026"/>
+            <w:tcBorders>
+              <w:top w:val="single" w:color="C9D3DF" w:sz="4"/>
+              <w:left w:val="single" w:color="1F4E79" w:sz="24"/>
+              <w:bottom w:val="single" w:color="C9D3DF" w:sz="4"/>
+              <w:right w:val="single" w:color="C9D3DF" w:sz="4"/>
+            </w:tcBorders>
+            <w:shd w:fill="EAF1F8" w:color="auto" w:val="clear"/>
+            <w:tcMar>
+              <w:top w:type="dxa" w:w="100"/>
+              <w:left w:type="dxa" w:w="200"/>
+              <w:bottom w:type="dxa" w:w="100"/>
+              <w:right w:type="dxa" w:w="160"/>
+            </w:tcMar>
+          </w:tcPr>
+          <w:p>
+            <w:pPr>
+              <w:spacing w:after="60"/>
+            </w:pPr>
+            <w:r>
+              <w:rPr>
+                <w:b/>
+                <w:bCs/>
+                <w:color w:val="1F4E79"/>
+              </w:rPr>
+              <w:t xml:space="preserve">Example</w:t>
+            </w:r>
+          </w:p>
+          <w:p>
+            <w:pPr>
+              <w:spacing w:after="40"/>
+            </w:pPr>
+            <w:r>
+              <w:rPr>
+                <w:sz w:val="20"/>
+                <w:szCs w:val="20"/>
+              </w:rPr>
+              <w:t xml:space="preserve">Admin sets Rainfall to </w:t>
+            </w:r>
+            <w:r>
+              <w:rPr>
+                <w:b/>
+                <w:bCs/>
+                <w:sz w:val="20"/>
+                <w:szCs w:val="20"/>
+              </w:rPr>
+              <w:t xml:space="preserve">160 mm</w:t>
+            </w:r>
+            <w:r>
+              <w:rPr>
+                <w:sz w:val="20"/>
+                <w:szCs w:val="20"/>
+              </w:rPr>
+              <w:t xml:space="preserve"> → toast “⚡ Trigger fired: WEATHER-001 — Now 160 mm in 2 zones for the next 60 min. 2 automatic claims created, 1 unpaid policy skipped.” Setting </w:t>
+            </w:r>
+            <w:r>
+              <w:rPr>
+                <w:b/>
+                <w:bCs/>
+                <w:sz w:val="20"/>
+                <w:szCs w:val="20"/>
+              </w:rPr>
+              <w:t xml:space="preserve">40 mm</w:t>
+            </w:r>
+            <w:r>
+              <w:rPr>
+                <w:sz w:val="20"/>
+                <w:szCs w:val="20"/>
+              </w:rPr>
+              <w:t xml:space="preserve"> → “No policy threshold was crossed.”</w:t>
+            </w:r>
+          </w:p>
+        </w:tc>
+      </w:tr>
+    </w:tbl>
+    <w:p>
+      <w:pPr>
+        <w:spacing w:after="80"/>
+      </w:pPr>
+    </w:p>
+    <w:p>
+      <w:pPr>
+        <w:pStyle w:val="Heading2"/>
+      </w:pPr>
+      <w:r>
+        <w:t xml:space="preserve">Journey 15 — Account status (suspend / reactivate)</w:t>
+      </w:r>
+    </w:p>
+    <w:p>
+      <w:pPr>
+        <w:pStyle w:val="ListParagraph"/>
+        <w:numPr>
+          <w:ilvl w:val="0"/>
+          <w:numId w:val="2"/>
+        </w:numPr>
+        <w:spacing w:after="60"/>
+      </w:pPr>
+      <w:r>
+        <w:t xml:space="preserve">Admin → </w:t>
+      </w:r>
+      <w:r>
+        <w:rPr>
+          <w:b/>
+          <w:bCs/>
+        </w:rPr>
+        <w:t xml:space="preserve">Users</w:t>
+      </w:r>
+      <w:r>
+        <w:t xml:space="preserve"> → change a profile status to </w:t>
+      </w:r>
+      <w:r>
+        <w:rPr>
+          <w:b/>
+          <w:bCs/>
+        </w:rPr>
+        <w:t xml:space="preserve">Active, Inactive or Suspended</w:t>
+      </w:r>
+      <w:r>
+        <w:t xml:space="preserve"> after a confirmation dialog (</w:t>
+      </w:r>
+      <w:r>
+        <w:rPr>
+          <w:rFonts w:ascii="Consolas" w:cs="Consolas" w:eastAsia="Consolas" w:hAnsi="Consolas"/>
+          <w:color w:val="9A3412"/>
+          <w:sz w:val="19"/>
+          <w:szCs w:val="19"/>
+        </w:rPr>
+        <w:t xml:space="preserve">PUT /api/users/{id}/status</w:t>
+      </w:r>
+      <w:r>
+        <w:t xml:space="preserve">). The change is audited (old → new).</w:t>
+      </w:r>
+    </w:p>
+    <w:p>
+      <w:pPr>
+        <w:pStyle w:val="ListParagraph"/>
+        <w:numPr>
+          <w:ilvl w:val="0"/>
+          <w:numId w:val="2"/>
+        </w:numPr>
+        <w:spacing w:after="60"/>
+      </w:pPr>
+      <w:r>
+        <w:rPr>
+          <w:b/>
+          <w:bCs/>
+        </w:rPr>
+        <w:t xml:space="preserve">Suspended or Inactive</w:t>
+      </w:r>
+      <w:r>
+        <w:t xml:space="preserve"> → all the user’s sessions are ended (refresh tokens revoked), and login and token refresh are refused: “Your account is suspended. Please contact support.” The current access token simply runs out within 15 minutes, after which the app signs the user out.</w:t>
+      </w:r>
+    </w:p>
+    <w:p>
+      <w:pPr>
+        <w:pStyle w:val="ListParagraph"/>
+        <w:numPr>
+          <w:ilvl w:val="0"/>
+          <w:numId w:val="2"/>
+        </w:numPr>
+        <w:spacing w:after="60"/>
+      </w:pPr>
+      <w:r>
+        <w:t xml:space="preserve">A customer closing their own account (</w:t>
+      </w:r>
+      <w:r>
+        <w:rPr>
+          <w:rFonts w:ascii="Consolas" w:cs="Consolas" w:eastAsia="Consolas" w:hAnsi="Consolas"/>
+          <w:color w:val="9A3412"/>
+          <w:sz w:val="19"/>
+          <w:szCs w:val="19"/>
+        </w:rPr>
+        <w:t xml:space="preserve">DELETE /api/users/me</w:t>
+      </w:r>
+      <w:r>
+        <w:t xml:space="preserve">) becomes </w:t>
+      </w:r>
+      <w:r>
+        <w:rPr>
+          <w:b/>
+          <w:bCs/>
+        </w:rPr>
+        <w:t xml:space="preserve">Inactive</w:t>
+      </w:r>
+      <w:r>
+        <w:t xml:space="preserve"> in the same way.</w:t>
+      </w:r>
+    </w:p>
+    <w:p>
+      <w:pPr>
+        <w:pStyle w:val="ListParagraph"/>
+        <w:numPr>
+          <w:ilvl w:val="0"/>
+          <w:numId w:val="2"/>
+        </w:numPr>
+        <w:spacing w:after="60"/>
+      </w:pPr>
+      <w:r>
+        <w:rPr>
+          <w:b/>
+          <w:bCs/>
+        </w:rPr>
+        <w:t xml:space="preserve">Active</w:t>
+      </w:r>
+      <w:r>
+        <w:t xml:space="preserve"> → the user can sign in again.</w:t>
+      </w:r>
+    </w:p>
+    <w:p>
+      <w:pPr>
+        <w:pStyle w:val="ListParagraph"/>
+        <w:numPr>
+          <w:ilvl w:val="0"/>
+          <w:numId w:val="2"/>
+        </w:numPr>
+        <w:spacing w:after="60"/>
+      </w:pPr>
+      <w:r>
+        <w:t xml:space="preserve">The suspension message is only shown after a correct password, so it does not reveal which emails exist.</w:t>
       </w:r>
     </w:p>
     <w:p>
@@ -9804,7 +10720,7 @@
                 <w:sz w:val="19"/>
                 <w:szCs w:val="19"/>
               </w:rPr>
-              <w:t xml:space="preserve">SUBMITTED → UNDER_REVIEW → APPROVED → SETTLED</w:t>
+              <w:t xml:space="preserve">SUBMITTED → UNDER_REVIEW → APPROVED → SETTLED (automatically when the payout succeeds)</w:t>
             </w:r>
           </w:p>
           <w:p>
@@ -9923,16 +10839,16 @@
                 <w:sz w:val="19"/>
                 <w:szCs w:val="19"/>
               </w:rPr>
-              <w:t xml:space="preserve">PENDING → PROCESSING → SUCCESS</w:t>
-            </w:r>
-          </w:p>
-          <w:p>
-            <w:r>
-              <w:rPr>
-                <w:sz w:val="19"/>
-                <w:szCs w:val="19"/>
-              </w:rPr>
-              <w:t xml:space="preserve">PROCESSING → FAILED → PROCESSING (retry, max 3 automatic)</w:t>
+              <w:t xml:space="preserve">Created and paid at once → SUCCESS (no admin step)</w:t>
+            </w:r>
+          </w:p>
+          <w:p>
+            <w:r>
+              <w:rPr>
+                <w:sz w:val="19"/>
+                <w:szCs w:val="19"/>
+              </w:rPr>
+              <w:t xml:space="preserve">FAILED (older payouts only) → retried automatically (max 3) or by admin Retry → SUCCESS</w:t>
             </w:r>
           </w:p>
         </w:tc>
@@ -9961,7 +10877,7 @@
                 <w:sz w:val="19"/>
                 <w:szCs w:val="19"/>
               </w:rPr>
-              <w:t xml:space="preserve">User</w:t>
+              <w:t xml:space="preserve">User profile</w:t>
             </w:r>
           </w:p>
         </w:tc>
@@ -9988,7 +10904,61 @@
                 <w:sz w:val="19"/>
                 <w:szCs w:val="19"/>
               </w:rPr>
-              <w:t xml:space="preserve">ACTIVE ↔ disabled by admin (disabled users cannot log in)</w:t>
+              <w:t xml:space="preserve">ACTIVE ↔ INACTIVE ↔ SUSPENDED (admin). INACTIVE and SUSPENDED users are signed out and cannot log in. Customer closing the account → INACTIVE</w:t>
+            </w:r>
+          </w:p>
+        </w:tc>
+      </w:tr>
+      <w:tr>
+        <w:tc>
+          <w:tcPr>
+            <w:tcW w:type="dxa" w:w="1805"/>
+            <w:tcBorders>
+              <w:top w:val="single" w:color="C9D3DF" w:sz="4"/>
+              <w:left w:val="single" w:color="C9D3DF" w:sz="4"/>
+              <w:bottom w:val="single" w:color="C9D3DF" w:sz="4"/>
+              <w:right w:val="single" w:color="C9D3DF" w:sz="4"/>
+            </w:tcBorders>
+            <w:tcMar>
+              <w:top w:type="dxa" w:w="60"/>
+              <w:left w:type="dxa" w:w="100"/>
+              <w:bottom w:type="dxa" w:w="60"/>
+              <w:right w:type="dxa" w:w="100"/>
+            </w:tcMar>
+          </w:tcPr>
+          <w:p>
+            <w:r>
+              <w:rPr>
+                <w:sz w:val="19"/>
+                <w:szCs w:val="19"/>
+              </w:rPr>
+              <w:t xml:space="preserve">Zone</w:t>
+            </w:r>
+          </w:p>
+        </w:tc>
+        <w:tc>
+          <w:tcPr>
+            <w:tcW w:type="dxa" w:w="7221"/>
+            <w:tcBorders>
+              <w:top w:val="single" w:color="C9D3DF" w:sz="4"/>
+              <w:left w:val="single" w:color="C9D3DF" w:sz="4"/>
+              <w:bottom w:val="single" w:color="C9D3DF" w:sz="4"/>
+              <w:right w:val="single" w:color="C9D3DF" w:sz="4"/>
+            </w:tcBorders>
+            <w:tcMar>
+              <w:top w:type="dxa" w:w="60"/>
+              <w:left w:type="dxa" w:w="100"/>
+              <w:bottom w:type="dxa" w:w="60"/>
+              <w:right w:type="dxa" w:w="100"/>
+            </w:tcMar>
+          </w:tcPr>
+          <w:p>
+            <w:r>
+              <w:rPr>
+                <w:sz w:val="19"/>
+                <w:szCs w:val="19"/>
+              </w:rPr>
+              <w:t xml:space="preserve">ACTIVE ↔ INACTIVE | ARCHIVED; weather alert on / off; exposure cap set / removed</w:t>
             </w:r>
           </w:p>
         </w:tc>
@@ -14632,10 +15602,10 @@
           <w:b/>
           <w:bCs/>
         </w:rPr>
-        <w:t xml:space="preserve">“Use matching value” button</w:t>
-      </w:r>
-      <w:r>
-        <w:t xml:space="preserve"> (admin-current-measurements.component.ts):</w:t>
+        <w:t xml:space="preserve">“Fill in a value that triggers” button</w:t>
+      </w:r>
+      <w:r>
+        <w:t xml:space="preserve"> on the Trigger simulator (admin-current-measurements.component.ts):</w:t>
       </w:r>
     </w:p>
     <w:tbl>
@@ -15677,7 +16647,7 @@
                 <w:sz w:val="17"/>
                 <w:szCs w:val="17"/>
               </w:rPr>
-              <w:t xml:space="preserve">SUM / AVERAGE rules :  eachReading = threshold × margin ÷ count   (4 dp)</w:t>
+              <w:t xml:space="preserve">SUM rule                       :  eachReading = threshold × margin ÷ count   (4 dp)</w:t>
             </w:r>
           </w:p>
           <w:p>
@@ -15687,7 +16657,7 @@
                 <w:sz w:val="17"/>
                 <w:szCs w:val="17"/>
               </w:rPr>
-              <w:t xml:space="preserve">MIN / MAX / LATEST  :  eachReading = threshold × margin</w:t>
+              <w:t xml:space="preserve">AVERAGE / MIN / MAX / LATEST   :  eachReading = threshold × margin</w:t>
             </w:r>
           </w:p>
           <w:p>
@@ -15748,7 +16718,7 @@
         <w:spacing w:before="120"/>
       </w:pPr>
       <w:r>
-        <w:t xml:space="preserve">Note for reviewers: for an AVERAGE rule the same per-reading split is used, so the average comes out as threshold × 1.10 ÷ count, which is below the threshold whenever count &gt; 1.</w:t>
+        <w:t xml:space="preserve">Example AVERAGE ≥ 50 mm: every reading = 50 × 1.10 = 55 mm, so the average is 55 mm ≥ 50 → MATCHED. (Only a SUM rule spreads the target across readings.)</w:t>
       </w:r>
     </w:p>
     <w:p>
@@ -17890,7 +18860,7 @@
                 <w:sz w:val="19"/>
                 <w:szCs w:val="19"/>
               </w:rPr>
-              <w:t xml:space="preserve">Payout auto-retry</w:t>
+              <w:t xml:space="preserve">Payout amount</w:t>
             </w:r>
           </w:p>
         </w:tc>
@@ -17916,7 +18886,7 @@
                 <w:sz w:val="19"/>
                 <w:szCs w:val="19"/>
               </w:rPr>
-              <w:t xml:space="preserve">every 5 min: status FAILED and retryCount &lt; 3 → PROCESSING, retryCount + 1</w:t>
+              <w:t xml:space="preserve">payout.amount = claim.approvedAmount; paid immediately on approval</w:t>
             </w:r>
           </w:p>
         </w:tc>
@@ -17942,7 +18912,170 @@
                 <w:sz w:val="19"/>
                 <w:szCs w:val="19"/>
               </w:rPr>
+              <w:t xml:space="preserve">approved ₹35,000 → ₹35,000 paid</w:t>
+            </w:r>
+          </w:p>
+        </w:tc>
+      </w:tr>
+      <w:tr>
+        <w:tc>
+          <w:tcPr>
+            <w:tcW w:type="dxa" w:w="1985"/>
+            <w:tcBorders>
+              <w:top w:val="single" w:color="C9D3DF" w:sz="4"/>
+              <w:left w:val="single" w:color="C9D3DF" w:sz="4"/>
+              <w:bottom w:val="single" w:color="C9D3DF" w:sz="4"/>
+              <w:right w:val="single" w:color="C9D3DF" w:sz="4"/>
+            </w:tcBorders>
+            <w:shd w:fill="F3F4F6" w:color="auto" w:val="clear"/>
+            <w:tcMar>
+              <w:top w:type="dxa" w:w="60"/>
+              <w:left w:type="dxa" w:w="100"/>
+              <w:bottom w:type="dxa" w:w="60"/>
+              <w:right w:type="dxa" w:w="100"/>
+            </w:tcMar>
+          </w:tcPr>
+          <w:p>
+            <w:r>
+              <w:rPr>
+                <w:sz w:val="19"/>
+                <w:szCs w:val="19"/>
+              </w:rPr>
+              <w:t xml:space="preserve">Payout sweep</w:t>
+            </w:r>
+          </w:p>
+        </w:tc>
+        <w:tc>
+          <w:tcPr>
+            <w:tcW w:type="dxa" w:w="4513"/>
+            <w:tcBorders>
+              <w:top w:val="single" w:color="C9D3DF" w:sz="4"/>
+              <w:left w:val="single" w:color="C9D3DF" w:sz="4"/>
+              <w:bottom w:val="single" w:color="C9D3DF" w:sz="4"/>
+              <w:right w:val="single" w:color="C9D3DF" w:sz="4"/>
+            </w:tcBorders>
+            <w:shd w:fill="F3F4F6" w:color="auto" w:val="clear"/>
+            <w:tcMar>
+              <w:top w:type="dxa" w:w="60"/>
+              <w:left w:type="dxa" w:w="100"/>
+              <w:bottom w:type="dxa" w:w="60"/>
+              <w:right w:type="dxa" w:w="100"/>
+            </w:tcMar>
+          </w:tcPr>
+          <w:p>
+            <w:r>
+              <w:rPr>
+                <w:sz w:val="19"/>
+                <w:szCs w:val="19"/>
+              </w:rPr>
+              <w:t xml:space="preserve">30 s after start, then every 5 min: PENDING / PROCESSING → paid; FAILED and retryCount &lt; 3 → retryCount + 1, paid</w:t>
+            </w:r>
+          </w:p>
+        </w:tc>
+        <w:tc>
+          <w:tcPr>
+            <w:tcW w:type="dxa" w:w="2528"/>
+            <w:tcBorders>
+              <w:top w:val="single" w:color="C9D3DF" w:sz="4"/>
+              <w:left w:val="single" w:color="C9D3DF" w:sz="4"/>
+              <w:bottom w:val="single" w:color="C9D3DF" w:sz="4"/>
+              <w:right w:val="single" w:color="C9D3DF" w:sz="4"/>
+            </w:tcBorders>
+            <w:shd w:fill="F3F4F6" w:color="auto" w:val="clear"/>
+            <w:tcMar>
+              <w:top w:type="dxa" w:w="60"/>
+              <w:left w:type="dxa" w:w="100"/>
+              <w:bottom w:type="dxa" w:w="60"/>
+              <w:right w:type="dxa" w:w="100"/>
+            </w:tcMar>
+          </w:tcPr>
+          <w:p>
+            <w:r>
+              <w:rPr>
+                <w:sz w:val="19"/>
+                <w:szCs w:val="19"/>
+              </w:rPr>
               <w:t xml:space="preserve">max 3 automatic retries</w:t>
+            </w:r>
+          </w:p>
+        </w:tc>
+      </w:tr>
+      <w:tr>
+        <w:tc>
+          <w:tcPr>
+            <w:tcW w:type="dxa" w:w="1985"/>
+            <w:tcBorders>
+              <w:top w:val="single" w:color="C9D3DF" w:sz="4"/>
+              <w:left w:val="single" w:color="C9D3DF" w:sz="4"/>
+              <w:bottom w:val="single" w:color="C9D3DF" w:sz="4"/>
+              <w:right w:val="single" w:color="C9D3DF" w:sz="4"/>
+            </w:tcBorders>
+            <w:tcMar>
+              <w:top w:type="dxa" w:w="60"/>
+              <w:left w:type="dxa" w:w="100"/>
+              <w:bottom w:type="dxa" w:w="60"/>
+              <w:right w:type="dxa" w:w="100"/>
+            </w:tcMar>
+          </w:tcPr>
+          <w:p>
+            <w:r>
+              <w:rPr>
+                <w:sz w:val="19"/>
+                <w:szCs w:val="19"/>
+              </w:rPr>
+              <w:t xml:space="preserve">Admin reading hold</w:t>
+            </w:r>
+          </w:p>
+        </w:tc>
+        <w:tc>
+          <w:tcPr>
+            <w:tcW w:type="dxa" w:w="4513"/>
+            <w:tcBorders>
+              <w:top w:val="single" w:color="C9D3DF" w:sz="4"/>
+              <w:left w:val="single" w:color="C9D3DF" w:sz="4"/>
+              <w:bottom w:val="single" w:color="C9D3DF" w:sz="4"/>
+              <w:right w:val="single" w:color="C9D3DF" w:sz="4"/>
+            </w:tcBorders>
+            <w:tcMar>
+              <w:top w:type="dxa" w:w="60"/>
+              <w:left w:type="dxa" w:w="100"/>
+              <w:bottom w:type="dxa" w:w="60"/>
+              <w:right w:type="dxa" w:w="100"/>
+            </w:tcMar>
+          </w:tcPr>
+          <w:p>
+            <w:r>
+              <w:rPr>
+                <w:sz w:val="19"/>
+                <w:szCs w:val="19"/>
+              </w:rPr>
+              <w:t xml:space="preserve">feed skips a zone + type while its latest reading is MANUAL and newer than 60 min</w:t>
+            </w:r>
+          </w:p>
+        </w:tc>
+        <w:tc>
+          <w:tcPr>
+            <w:tcW w:type="dxa" w:w="2528"/>
+            <w:tcBorders>
+              <w:top w:val="single" w:color="C9D3DF" w:sz="4"/>
+              <w:left w:val="single" w:color="C9D3DF" w:sz="4"/>
+              <w:bottom w:val="single" w:color="C9D3DF" w:sz="4"/>
+              <w:right w:val="single" w:color="C9D3DF" w:sz="4"/>
+            </w:tcBorders>
+            <w:tcMar>
+              <w:top w:type="dxa" w:w="60"/>
+              <w:left w:type="dxa" w:w="100"/>
+              <w:bottom w:type="dxa" w:w="60"/>
+              <w:right w:type="dxa" w:w="100"/>
+            </w:tcMar>
+          </w:tcPr>
+          <w:p>
+            <w:r>
+              <w:rPr>
+                <w:sz w:val="19"/>
+                <w:szCs w:val="19"/>
+              </w:rPr>
+              <w:t xml:space="preserve">set 10:00 → feed resumes 11:00</w:t>
             </w:r>
           </w:p>
         </w:tc>
@@ -20958,7 +22091,7 @@
                 <w:sz w:val="19"/>
                 <w:szCs w:val="19"/>
               </w:rPr>
-              <w:t xml:space="preserve">/admin/dashboard, products (+new, edit), product-thresholds, products/:id/threshold, current-measurements, trigger-events, zones, zone-map, perils, pricing-rules, policies, claims, payments, payouts, users, notifications, audit, activity</w:t>
+              <w:t xml:space="preserve">/admin/dashboard, products (+new, edit), product-thresholds, products/:id/threshold, current-measurements (Trigger simulator), trigger-events, zones, zone-exposure, zone-map, perils, pricing-rules, policies, claims, payments, payouts, users, notifications, audit, activity</w:t>
             </w:r>
           </w:p>
         </w:tc>
@@ -20984,7 +22117,7 @@
                 <w:sz w:val="19"/>
                 <w:szCs w:val="19"/>
               </w:rPr>
-              <w:t xml:space="preserve">Configure the platform, simulate weather data, run payouts, monitor everything</w:t>
+              <w:t xml:space="preserve">Configure the platform, simulate weather data, control zone sales, monitor everything (payouts are automatic)</w:t>
             </w:r>
           </w:p>
         </w:tc>
@@ -22580,7 +23713,170 @@
                 <w:sz w:val="19"/>
                 <w:szCs w:val="19"/>
               </w:rPr>
-              <w:t xml:space="preserve">Record value → evaluate → auto claims (Journey 6)</w:t>
+              <w:t xml:space="preserve">Trigger simulator: value for one product + zone → evaluate → auto claims (Journey 6)</w:t>
+            </w:r>
+          </w:p>
+        </w:tc>
+      </w:tr>
+      <w:tr>
+        <w:tc>
+          <w:tcPr>
+            <w:tcW w:type="dxa" w:w="4513"/>
+            <w:tcBorders>
+              <w:top w:val="single" w:color="C9D3DF" w:sz="4"/>
+              <w:left w:val="single" w:color="C9D3DF" w:sz="4"/>
+              <w:bottom w:val="single" w:color="C9D3DF" w:sz="4"/>
+              <w:right w:val="single" w:color="C9D3DF" w:sz="4"/>
+            </w:tcBorders>
+            <w:shd w:fill="F3F4F6" w:color="auto" w:val="clear"/>
+            <w:tcMar>
+              <w:top w:type="dxa" w:w="60"/>
+              <w:left w:type="dxa" w:w="100"/>
+              <w:bottom w:type="dxa" w:w="60"/>
+              <w:right w:type="dxa" w:w="100"/>
+            </w:tcMar>
+          </w:tcPr>
+          <w:p>
+            <w:r>
+              <w:rPr>
+                <w:sz w:val="19"/>
+                <w:szCs w:val="19"/>
+              </w:rPr>
+              <w:t xml:space="preserve">GET / PUT /api/triggers/measurements/current</w:t>
+            </w:r>
+          </w:p>
+        </w:tc>
+        <w:tc>
+          <w:tcPr>
+            <w:tcW w:type="dxa" w:w="1263"/>
+            <w:tcBorders>
+              <w:top w:val="single" w:color="C9D3DF" w:sz="4"/>
+              <w:left w:val="single" w:color="C9D3DF" w:sz="4"/>
+              <w:bottom w:val="single" w:color="C9D3DF" w:sz="4"/>
+              <w:right w:val="single" w:color="C9D3DF" w:sz="4"/>
+            </w:tcBorders>
+            <w:shd w:fill="F3F4F6" w:color="auto" w:val="clear"/>
+            <w:tcMar>
+              <w:top w:type="dxa" w:w="60"/>
+              <w:left w:type="dxa" w:w="100"/>
+              <w:bottom w:type="dxa" w:w="60"/>
+              <w:right w:type="dxa" w:w="100"/>
+            </w:tcMar>
+          </w:tcPr>
+          <w:p>
+            <w:r>
+              <w:rPr>
+                <w:sz w:val="19"/>
+                <w:szCs w:val="19"/>
+              </w:rPr>
+              <w:t xml:space="preserve">Staff / Admin</w:t>
+            </w:r>
+          </w:p>
+        </w:tc>
+        <w:tc>
+          <w:tcPr>
+            <w:tcW w:type="dxa" w:w="3250"/>
+            <w:tcBorders>
+              <w:top w:val="single" w:color="C9D3DF" w:sz="4"/>
+              <w:left w:val="single" w:color="C9D3DF" w:sz="4"/>
+              <w:bottom w:val="single" w:color="C9D3DF" w:sz="4"/>
+              <w:right w:val="single" w:color="C9D3DF" w:sz="4"/>
+            </w:tcBorders>
+            <w:shd w:fill="F3F4F6" w:color="auto" w:val="clear"/>
+            <w:tcMar>
+              <w:top w:type="dxa" w:w="60"/>
+              <w:left w:type="dxa" w:w="100"/>
+              <w:bottom w:type="dxa" w:w="60"/>
+              <w:right w:type="dxa" w:w="100"/>
+            </w:tcMar>
+          </w:tcPr>
+          <w:p>
+            <w:r>
+              <w:rPr>
+                <w:sz w:val="19"/>
+                <w:szCs w:val="19"/>
+              </w:rPr>
+              <w:t xml:space="preserve">Latest reading per measurement type; admin sets a reading for all zones and triggers products (Journey 14)</w:t>
+            </w:r>
+          </w:p>
+        </w:tc>
+      </w:tr>
+      <w:tr>
+        <w:tc>
+          <w:tcPr>
+            <w:tcW w:type="dxa" w:w="4513"/>
+            <w:tcBorders>
+              <w:top w:val="single" w:color="C9D3DF" w:sz="4"/>
+              <w:left w:val="single" w:color="C9D3DF" w:sz="4"/>
+              <w:bottom w:val="single" w:color="C9D3DF" w:sz="4"/>
+              <w:right w:val="single" w:color="C9D3DF" w:sz="4"/>
+            </w:tcBorders>
+            <w:tcMar>
+              <w:top w:type="dxa" w:w="60"/>
+              <w:left w:type="dxa" w:w="100"/>
+              <w:bottom w:type="dxa" w:w="60"/>
+              <w:right w:type="dxa" w:w="100"/>
+            </w:tcMar>
+          </w:tcPr>
+          <w:p>
+            <w:r>
+              <w:rPr>
+                <w:sz w:val="19"/>
+                <w:szCs w:val="19"/>
+              </w:rPr>
+              <w:t xml:space="preserve">PUT /api/triggers/zones/{id}/alert, /exposure-cap</w:t>
+            </w:r>
+          </w:p>
+        </w:tc>
+        <w:tc>
+          <w:tcPr>
+            <w:tcW w:type="dxa" w:w="1263"/>
+            <w:tcBorders>
+              <w:top w:val="single" w:color="C9D3DF" w:sz="4"/>
+              <w:left w:val="single" w:color="C9D3DF" w:sz="4"/>
+              <w:bottom w:val="single" w:color="C9D3DF" w:sz="4"/>
+              <w:right w:val="single" w:color="C9D3DF" w:sz="4"/>
+            </w:tcBorders>
+            <w:tcMar>
+              <w:top w:type="dxa" w:w="60"/>
+              <w:left w:type="dxa" w:w="100"/>
+              <w:bottom w:type="dxa" w:w="60"/>
+              <w:right w:type="dxa" w:w="100"/>
+            </w:tcMar>
+          </w:tcPr>
+          <w:p>
+            <w:r>
+              <w:rPr>
+                <w:sz w:val="19"/>
+                <w:szCs w:val="19"/>
+              </w:rPr>
+              <w:t xml:space="preserve">Admin</w:t>
+            </w:r>
+          </w:p>
+        </w:tc>
+        <w:tc>
+          <w:tcPr>
+            <w:tcW w:type="dxa" w:w="3250"/>
+            <w:tcBorders>
+              <w:top w:val="single" w:color="C9D3DF" w:sz="4"/>
+              <w:left w:val="single" w:color="C9D3DF" w:sz="4"/>
+              <w:bottom w:val="single" w:color="C9D3DF" w:sz="4"/>
+              <w:right w:val="single" w:color="C9D3DF" w:sz="4"/>
+            </w:tcBorders>
+            <w:tcMar>
+              <w:top w:type="dxa" w:w="60"/>
+              <w:left w:type="dxa" w:w="100"/>
+              <w:bottom w:type="dxa" w:w="60"/>
+              <w:right w:type="dxa" w:w="100"/>
+            </w:tcMar>
+          </w:tcPr>
+          <w:p>
+            <w:r>
+              <w:rPr>
+                <w:sz w:val="19"/>
+                <w:szCs w:val="19"/>
+              </w:rPr>
+              <w:t xml:space="preserve">Weather alert and exposure cap (Journey 13)</w:t>
             </w:r>
           </w:p>
         </w:tc>
@@ -23022,7 +24318,7 @@
         <w:t xml:space="preserve">demo.feed.enabled</w:t>
       </w:r>
       <w:r>
-        <w:t xml:space="preserve">, every 60 s) produces sample readings for the live measurement widgets; data older than 3 days is removed.</w:t>
+        <w:t xml:space="preserve">, every 60 s) produces sample readings for the live measurement widgets; it does not overwrite a reading an admin set in the last 60 minutes; data older than 3 days is removed.</w:t>
       </w:r>
     </w:p>
     <w:p>
@@ -23466,7 +24762,7 @@
                 <w:sz w:val="19"/>
                 <w:szCs w:val="19"/>
               </w:rPr>
-              <w:t xml:space="preserve">Decisions</w:t>
+              <w:t xml:space="preserve">Decisions (settle = manual “Mark as settled”; normally automatic)</w:t>
             </w:r>
           </w:p>
         </w:tc>
@@ -24022,7 +25318,7 @@
                 <w:sz w:val="19"/>
                 <w:szCs w:val="19"/>
               </w:rPr>
-              <w:t xml:space="preserve">GET /api/financial/payouts/me, /admin/all, PUT /{id}/process | success | fail | retry, GET /{id}/receipt</w:t>
+              <w:t xml:space="preserve">GET /api/financial/payouts/me, /admin/all, PUT /{id}/retry, GET /{id}/receipt</w:t>
             </w:r>
           </w:p>
         </w:tc>
@@ -24076,7 +25372,7 @@
                 <w:sz w:val="19"/>
                 <w:szCs w:val="19"/>
               </w:rPr>
-              <w:t xml:space="preserve">Payouts &amp; receipts</w:t>
+              <w:t xml:space="preserve">Payout history, retry of failed payouts, receipts (payouts are paid automatically)</w:t>
             </w:r>
           </w:p>
         </w:tc>
@@ -25323,7 +26619,7 @@
                 <w:sz w:val="19"/>
                 <w:szCs w:val="19"/>
               </w:rPr>
-              <w:t xml:space="preserve">Every 5 min</w:t>
+              <w:t xml:space="preserve">30 s after start, then every 5 min</w:t>
             </w:r>
           </w:p>
         </w:tc>
@@ -25350,7 +26646,7 @@
                 <w:sz w:val="19"/>
                 <w:szCs w:val="19"/>
               </w:rPr>
-              <w:t xml:space="preserve">Retry FAILED payouts (max 3)</w:t>
+              <w:t xml:space="preserve">Pay waiting payouts; retry FAILED ones (max 3)</w:t>
             </w:r>
           </w:p>
         </w:tc>
@@ -25782,7 +27078,7 @@
                 <w:sz w:val="19"/>
                 <w:szCs w:val="19"/>
               </w:rPr>
-              <w:t xml:space="preserve">Sample live readings for widgets</w:t>
+              <w:t xml:space="preserve">Sample live readings; leaves admin-set readings for 60 min</w:t>
             </w:r>
           </w:p>
         </w:tc>
@@ -26231,7 +27527,7 @@
                 <w:sz w:val="19"/>
                 <w:szCs w:val="19"/>
               </w:rPr>
-              <w:t xml:space="preserve">Automatic payout creation on approval</w:t>
+              <w:t xml:space="preserve">Automatic payout on approval</w:t>
             </w:r>
           </w:p>
         </w:tc>
@@ -26257,7 +27553,117 @@
                 <w:sz w:val="19"/>
                 <w:szCs w:val="19"/>
               </w:rPr>
-              <w:t xml:space="preserve">No manual hand-off between claims and finance</w:t>
+              <w:t xml:space="preserve">No manual hand-off between claims and finance: approval pays the customer and settles the claim</w:t>
+            </w:r>
+          </w:p>
+        </w:tc>
+      </w:tr>
+      <w:tr>
+        <w:tc>
+          <w:tcPr>
+            <w:tcW w:type="dxa" w:w="3610"/>
+            <w:tcBorders>
+              <w:top w:val="single" w:color="C9D3DF" w:sz="4"/>
+              <w:left w:val="single" w:color="C9D3DF" w:sz="4"/>
+              <w:bottom w:val="single" w:color="C9D3DF" w:sz="4"/>
+              <w:right w:val="single" w:color="C9D3DF" w:sz="4"/>
+            </w:tcBorders>
+            <w:shd w:fill="F3F4F6" w:color="auto" w:val="clear"/>
+            <w:tcMar>
+              <w:top w:type="dxa" w:w="60"/>
+              <w:left w:type="dxa" w:w="100"/>
+              <w:bottom w:type="dxa" w:w="60"/>
+              <w:right w:type="dxa" w:w="100"/>
+            </w:tcMar>
+          </w:tcPr>
+          <w:p>
+            <w:r>
+              <w:rPr>
+                <w:sz w:val="19"/>
+                <w:szCs w:val="19"/>
+              </w:rPr>
+              <w:t xml:space="preserve">Only paid policies are paid out</w:t>
+            </w:r>
+          </w:p>
+        </w:tc>
+        <w:tc>
+          <w:tcPr>
+            <w:tcW w:type="dxa" w:w="5416"/>
+            <w:tcBorders>
+              <w:top w:val="single" w:color="C9D3DF" w:sz="4"/>
+              <w:left w:val="single" w:color="C9D3DF" w:sz="4"/>
+              <w:bottom w:val="single" w:color="C9D3DF" w:sz="4"/>
+              <w:right w:val="single" w:color="C9D3DF" w:sz="4"/>
+            </w:tcBorders>
+            <w:shd w:fill="F3F4F6" w:color="auto" w:val="clear"/>
+            <w:tcMar>
+              <w:top w:type="dxa" w:w="60"/>
+              <w:left w:type="dxa" w:w="100"/>
+              <w:bottom w:type="dxa" w:w="60"/>
+              <w:right w:type="dxa" w:w="100"/>
+            </w:tcMar>
+          </w:tcPr>
+          <w:p>
+            <w:r>
+              <w:rPr>
+                <w:sz w:val="19"/>
+                <w:szCs w:val="19"/>
+              </w:rPr>
+              <w:t xml:space="preserve">Unpaid policies are skipped by the trigger and cannot file manual claims</w:t>
+            </w:r>
+          </w:p>
+        </w:tc>
+      </w:tr>
+      <w:tr>
+        <w:tc>
+          <w:tcPr>
+            <w:tcW w:type="dxa" w:w="3610"/>
+            <w:tcBorders>
+              <w:top w:val="single" w:color="C9D3DF" w:sz="4"/>
+              <w:left w:val="single" w:color="C9D3DF" w:sz="4"/>
+              <w:bottom w:val="single" w:color="C9D3DF" w:sz="4"/>
+              <w:right w:val="single" w:color="C9D3DF" w:sz="4"/>
+            </w:tcBorders>
+            <w:tcMar>
+              <w:top w:type="dxa" w:w="60"/>
+              <w:left w:type="dxa" w:w="100"/>
+              <w:bottom w:type="dxa" w:w="60"/>
+              <w:right w:type="dxa" w:w="100"/>
+            </w:tcMar>
+          </w:tcPr>
+          <w:p>
+            <w:r>
+              <w:rPr>
+                <w:sz w:val="19"/>
+                <w:szCs w:val="19"/>
+              </w:rPr>
+              <w:t xml:space="preserve">Zone weather alert + exposure cap</w:t>
+            </w:r>
+          </w:p>
+        </w:tc>
+        <w:tc>
+          <w:tcPr>
+            <w:tcW w:type="dxa" w:w="5416"/>
+            <w:tcBorders>
+              <w:top w:val="single" w:color="C9D3DF" w:sz="4"/>
+              <w:left w:val="single" w:color="C9D3DF" w:sz="4"/>
+              <w:bottom w:val="single" w:color="C9D3DF" w:sz="4"/>
+              <w:right w:val="single" w:color="C9D3DF" w:sz="4"/>
+            </w:tcBorders>
+            <w:tcMar>
+              <w:top w:type="dxa" w:w="60"/>
+              <w:left w:type="dxa" w:w="100"/>
+              <w:bottom w:type="dxa" w:w="60"/>
+              <w:right w:type="dxa" w:w="100"/>
+            </w:tcMar>
+          </w:tcPr>
+          <w:p>
+            <w:r>
+              <w:rPr>
+                <w:sz w:val="19"/>
+                <w:szCs w:val="19"/>
+              </w:rPr>
+              <w:t xml:space="preserve">Stops cover being bought after a storm warning and limits the total risk per zone</w:t>
             </w:r>
           </w:p>
         </w:tc>
@@ -26429,7 +27835,7 @@
         <w:pStyle w:val="ListParagraph"/>
         <w:numPr>
           <w:ilvl w:val="0"/>
-          <w:numId w:val="13"/>
+          <w:numId w:val="14"/>
         </w:numPr>
         <w:spacing w:after="80"/>
       </w:pPr>
@@ -26449,7 +27855,7 @@
         <w:pStyle w:val="ListParagraph"/>
         <w:numPr>
           <w:ilvl w:val="0"/>
-          <w:numId w:val="13"/>
+          <w:numId w:val="14"/>
         </w:numPr>
         <w:spacing w:after="80"/>
       </w:pPr>
@@ -26481,7 +27887,7 @@
         <w:pStyle w:val="ListParagraph"/>
         <w:numPr>
           <w:ilvl w:val="0"/>
-          <w:numId w:val="13"/>
+          <w:numId w:val="14"/>
         </w:numPr>
         <w:spacing w:after="80"/>
       </w:pPr>
@@ -26501,7 +27907,7 @@
         <w:pStyle w:val="ListParagraph"/>
         <w:numPr>
           <w:ilvl w:val="0"/>
-          <w:numId w:val="13"/>
+          <w:numId w:val="14"/>
         </w:numPr>
         <w:spacing w:after="80"/>
       </w:pPr>
@@ -27255,7 +28661,7 @@
                 <w:sz w:val="19"/>
                 <w:szCs w:val="19"/>
               </w:rPr>
-              <w:t xml:space="preserve">Current Measurements → WEATHER-001 / Hyderabad → enter 120 → submit</w:t>
+              <w:t xml:space="preserve">Trigger simulator → WEATHER-001 / Hyderabad → enter 120 → Simulate reading</w:t>
             </w:r>
           </w:p>
         </w:tc>
@@ -27364,7 +28770,7 @@
                 <w:sz w:val="19"/>
                 <w:szCs w:val="19"/>
               </w:rPr>
-              <w:t xml:space="preserve">Enter 170 → submit</w:t>
+              <w:t xml:space="preserve">Enter 170 → Simulate reading (or: header gauge → Rainfall → Update value 170)</w:t>
             </w:r>
           </w:p>
         </w:tc>
@@ -27607,7 +29013,7 @@
                 <w:sz w:val="19"/>
                 <w:szCs w:val="19"/>
               </w:rPr>
-              <w:t xml:space="preserve">Payout PENDING created automatically</w:t>
+              <w:t xml:space="preserve">Payout paid automatically; claim SETTLED</w:t>
             </w:r>
           </w:p>
         </w:tc>
@@ -27661,7 +29067,7 @@
                 <w:sz w:val="19"/>
                 <w:szCs w:val="19"/>
               </w:rPr>
-              <w:t xml:space="preserve">admin</w:t>
+              <w:t xml:space="preserve">Ravi / admin</w:t>
             </w:r>
           </w:p>
         </w:tc>
@@ -27687,7 +29093,7 @@
                 <w:sz w:val="19"/>
                 <w:szCs w:val="19"/>
               </w:rPr>
-              <w:t xml:space="preserve">Payouts → Process → Mark success</w:t>
+              <w:t xml:space="preserve">Ravi: Payments → Payouts tab; admin: Payouts</w:t>
             </w:r>
           </w:p>
         </w:tc>
@@ -27713,7 +29119,7 @@
                 <w:sz w:val="19"/>
                 <w:szCs w:val="19"/>
               </w:rPr>
-              <w:t xml:space="preserve">Customer notified; receipt PDF; event processed</w:t>
+              <w:t xml:space="preserve">SUCCESS with AUTO-… transfer, receipt PDF, no admin action needed</w:t>
             </w:r>
           </w:p>
         </w:tc>
@@ -27903,6 +29309,115 @@
                 <w:sz w:val="19"/>
                 <w:szCs w:val="19"/>
               </w:rPr>
+              <w:t xml:space="preserve">Zones → Raise alert on Hyderabad; Ravi tries to apply again</w:t>
+            </w:r>
+          </w:p>
+        </w:tc>
+        <w:tc>
+          <w:tcPr>
+            <w:tcW w:type="dxa" w:w="3160"/>
+            <w:tcBorders>
+              <w:top w:val="single" w:color="C9D3DF" w:sz="4"/>
+              <w:left w:val="single" w:color="C9D3DF" w:sz="4"/>
+              <w:bottom w:val="single" w:color="C9D3DF" w:sz="4"/>
+              <w:right w:val="single" w:color="C9D3DF" w:sz="4"/>
+            </w:tcBorders>
+            <w:tcMar>
+              <w:top w:type="dxa" w:w="60"/>
+              <w:left w:type="dxa" w:w="100"/>
+              <w:bottom w:type="dxa" w:w="60"/>
+              <w:right w:type="dxa" w:w="100"/>
+            </w:tcMar>
+          </w:tcPr>
+          <w:p>
+            <w:r>
+              <w:rPr>
+                <w:sz w:val="19"/>
+                <w:szCs w:val="19"/>
+              </w:rPr>
+              <w:t xml:space="preserve">Sales paused while the alert is on</w:t>
+            </w:r>
+          </w:p>
+        </w:tc>
+      </w:tr>
+      <w:tr>
+        <w:tc>
+          <w:tcPr>
+            <w:tcW w:type="dxa" w:w="451"/>
+            <w:tcBorders>
+              <w:top w:val="single" w:color="C9D3DF" w:sz="4"/>
+              <w:left w:val="single" w:color="C9D3DF" w:sz="4"/>
+              <w:bottom w:val="single" w:color="C9D3DF" w:sz="4"/>
+              <w:right w:val="single" w:color="C9D3DF" w:sz="4"/>
+            </w:tcBorders>
+            <w:shd w:fill="F3F4F6" w:color="auto" w:val="clear"/>
+            <w:tcMar>
+              <w:top w:type="dxa" w:w="60"/>
+              <w:left w:type="dxa" w:w="100"/>
+              <w:bottom w:type="dxa" w:w="60"/>
+              <w:right w:type="dxa" w:w="100"/>
+            </w:tcMar>
+          </w:tcPr>
+          <w:p>
+            <w:r>
+              <w:rPr>
+                <w:sz w:val="19"/>
+                <w:szCs w:val="19"/>
+              </w:rPr>
+              <w:t xml:space="preserve">12</w:t>
+            </w:r>
+          </w:p>
+        </w:tc>
+        <w:tc>
+          <w:tcPr>
+            <w:tcW w:type="dxa" w:w="1534"/>
+            <w:tcBorders>
+              <w:top w:val="single" w:color="C9D3DF" w:sz="4"/>
+              <w:left w:val="single" w:color="C9D3DF" w:sz="4"/>
+              <w:bottom w:val="single" w:color="C9D3DF" w:sz="4"/>
+              <w:right w:val="single" w:color="C9D3DF" w:sz="4"/>
+            </w:tcBorders>
+            <w:shd w:fill="F3F4F6" w:color="auto" w:val="clear"/>
+            <w:tcMar>
+              <w:top w:type="dxa" w:w="60"/>
+              <w:left w:type="dxa" w:w="100"/>
+              <w:bottom w:type="dxa" w:w="60"/>
+              <w:right w:type="dxa" w:w="100"/>
+            </w:tcMar>
+          </w:tcPr>
+          <w:p>
+            <w:r>
+              <w:rPr>
+                <w:sz w:val="19"/>
+                <w:szCs w:val="19"/>
+              </w:rPr>
+              <w:t xml:space="preserve">admin</w:t>
+            </w:r>
+          </w:p>
+        </w:tc>
+        <w:tc>
+          <w:tcPr>
+            <w:tcW w:type="dxa" w:w="3881"/>
+            <w:tcBorders>
+              <w:top w:val="single" w:color="C9D3DF" w:sz="4"/>
+              <w:left w:val="single" w:color="C9D3DF" w:sz="4"/>
+              <w:bottom w:val="single" w:color="C9D3DF" w:sz="4"/>
+              <w:right w:val="single" w:color="C9D3DF" w:sz="4"/>
+            </w:tcBorders>
+            <w:shd w:fill="F3F4F6" w:color="auto" w:val="clear"/>
+            <w:tcMar>
+              <w:top w:type="dxa" w:w="60"/>
+              <w:left w:type="dxa" w:w="100"/>
+              <w:bottom w:type="dxa" w:w="60"/>
+              <w:right w:type="dxa" w:w="100"/>
+            </w:tcMar>
+          </w:tcPr>
+          <w:p>
+            <w:r>
+              <w:rPr>
+                <w:sz w:val="19"/>
+                <w:szCs w:val="19"/>
+              </w:rPr>
               <w:t xml:space="preserve">Audit log / Dashboard</w:t>
             </w:r>
           </w:p>
@@ -27916,6 +29431,7 @@
               <w:bottom w:val="single" w:color="C9D3DF" w:sz="4"/>
               <w:right w:val="single" w:color="C9D3DF" w:sz="4"/>
             </w:tcBorders>
+            <w:shd w:fill="F3F4F6" w:color="auto" w:val="clear"/>
             <w:tcMar>
               <w:top w:type="dxa" w:w="60"/>
               <w:left w:type="dxa" w:w="100"/>
@@ -28460,7 +29976,7 @@
                 <w:sz w:val="19"/>
                 <w:szCs w:val="19"/>
               </w:rPr>
-              <w:t xml:space="preserve">Eligibility is based on policy status ACTIVE and coverage dates for the zone; payment status is tracked separately (reminders + reconciliation).</w:t>
+              <w:t xml:space="preserve">Yes. When a trigger fires, policies whose premium is not paid are skipped (shown as “Skipped (premium unpaid)”), and a manual claim is refused until the premium is paid.</w:t>
             </w:r>
           </w:p>
         </w:tc>
@@ -28488,6 +30004,171 @@
                 <w:sz w:val="19"/>
                 <w:szCs w:val="19"/>
               </w:rPr>
+              <w:t xml:space="preserve">Who approves the payout?</w:t>
+            </w:r>
+          </w:p>
+        </w:tc>
+        <w:tc>
+          <w:tcPr>
+            <w:tcW w:type="dxa" w:w="6138"/>
+            <w:tcBorders>
+              <w:top w:val="single" w:color="C9D3DF" w:sz="4"/>
+              <w:left w:val="single" w:color="C9D3DF" w:sz="4"/>
+              <w:bottom w:val="single" w:color="C9D3DF" w:sz="4"/>
+              <w:right w:val="single" w:color="C9D3DF" w:sz="4"/>
+            </w:tcBorders>
+            <w:tcMar>
+              <w:top w:type="dxa" w:w="60"/>
+              <w:left w:type="dxa" w:w="100"/>
+              <w:bottom w:type="dxa" w:w="60"/>
+              <w:right w:type="dxa" w:w="100"/>
+            </w:tcMar>
+          </w:tcPr>
+          <w:p>
+            <w:r>
+              <w:rPr>
+                <w:sz w:val="19"/>
+                <w:szCs w:val="19"/>
+              </w:rPr>
+              <w:t xml:space="preserve">Nobody — approving the claim is the only decision. The payout is paid at once, the claim is settled and the customer is notified.</w:t>
+            </w:r>
+          </w:p>
+        </w:tc>
+      </w:tr>
+      <w:tr>
+        <w:tc>
+          <w:tcPr>
+            <w:tcW w:type="dxa" w:w="2888"/>
+            <w:tcBorders>
+              <w:top w:val="single" w:color="C9D3DF" w:sz="4"/>
+              <w:left w:val="single" w:color="C9D3DF" w:sz="4"/>
+              <w:bottom w:val="single" w:color="C9D3DF" w:sz="4"/>
+              <w:right w:val="single" w:color="C9D3DF" w:sz="4"/>
+            </w:tcBorders>
+            <w:shd w:fill="F3F4F6" w:color="auto" w:val="clear"/>
+            <w:tcMar>
+              <w:top w:type="dxa" w:w="60"/>
+              <w:left w:type="dxa" w:w="100"/>
+              <w:bottom w:type="dxa" w:w="60"/>
+              <w:right w:type="dxa" w:w="100"/>
+            </w:tcMar>
+          </w:tcPr>
+          <w:p>
+            <w:r>
+              <w:rPr>
+                <w:sz w:val="19"/>
+                <w:szCs w:val="19"/>
+              </w:rPr>
+              <w:t xml:space="preserve">Can a suspended user keep using the app?</w:t>
+            </w:r>
+          </w:p>
+        </w:tc>
+        <w:tc>
+          <w:tcPr>
+            <w:tcW w:type="dxa" w:w="6138"/>
+            <w:tcBorders>
+              <w:top w:val="single" w:color="C9D3DF" w:sz="4"/>
+              <w:left w:val="single" w:color="C9D3DF" w:sz="4"/>
+              <w:bottom w:val="single" w:color="C9D3DF" w:sz="4"/>
+              <w:right w:val="single" w:color="C9D3DF" w:sz="4"/>
+            </w:tcBorders>
+            <w:shd w:fill="F3F4F6" w:color="auto" w:val="clear"/>
+            <w:tcMar>
+              <w:top w:type="dxa" w:w="60"/>
+              <w:left w:type="dxa" w:w="100"/>
+              <w:bottom w:type="dxa" w:w="60"/>
+              <w:right w:type="dxa" w:w="100"/>
+            </w:tcMar>
+          </w:tcPr>
+          <w:p>
+            <w:r>
+              <w:rPr>
+                <w:sz w:val="19"/>
+                <w:szCs w:val="19"/>
+              </w:rPr>
+              <w:t xml:space="preserve">No. Suspending (or making inactive) ends their sessions and blocks login and token refresh; the last access token expires within 15 minutes.</w:t>
+            </w:r>
+          </w:p>
+        </w:tc>
+      </w:tr>
+      <w:tr>
+        <w:tc>
+          <w:tcPr>
+            <w:tcW w:type="dxa" w:w="2888"/>
+            <w:tcBorders>
+              <w:top w:val="single" w:color="C9D3DF" w:sz="4"/>
+              <w:left w:val="single" w:color="C9D3DF" w:sz="4"/>
+              <w:bottom w:val="single" w:color="C9D3DF" w:sz="4"/>
+              <w:right w:val="single" w:color="C9D3DF" w:sz="4"/>
+            </w:tcBorders>
+            <w:tcMar>
+              <w:top w:type="dxa" w:w="60"/>
+              <w:left w:type="dxa" w:w="100"/>
+              <w:bottom w:type="dxa" w:w="60"/>
+              <w:right w:type="dxa" w:w="100"/>
+            </w:tcMar>
+          </w:tcPr>
+          <w:p>
+            <w:r>
+              <w:rPr>
+                <w:sz w:val="19"/>
+                <w:szCs w:val="19"/>
+              </w:rPr>
+              <w:t xml:space="preserve">Can someone buy cover just before a storm?</w:t>
+            </w:r>
+          </w:p>
+        </w:tc>
+        <w:tc>
+          <w:tcPr>
+            <w:tcW w:type="dxa" w:w="6138"/>
+            <w:tcBorders>
+              <w:top w:val="single" w:color="C9D3DF" w:sz="4"/>
+              <w:left w:val="single" w:color="C9D3DF" w:sz="4"/>
+              <w:bottom w:val="single" w:color="C9D3DF" w:sz="4"/>
+              <w:right w:val="single" w:color="C9D3DF" w:sz="4"/>
+            </w:tcBorders>
+            <w:tcMar>
+              <w:top w:type="dxa" w:w="60"/>
+              <w:left w:type="dxa" w:w="100"/>
+              <w:bottom w:type="dxa" w:w="60"/>
+              <w:right w:type="dxa" w:w="100"/>
+            </w:tcMar>
+          </w:tcPr>
+          <w:p>
+            <w:r>
+              <w:rPr>
+                <w:sz w:val="19"/>
+                <w:szCs w:val="19"/>
+              </w:rPr>
+              <w:t xml:space="preserve">No. The admin raises a weather alert on the zone and new policies cannot be sold or approved there until it is cleared.</w:t>
+            </w:r>
+          </w:p>
+        </w:tc>
+      </w:tr>
+      <w:tr>
+        <w:tc>
+          <w:tcPr>
+            <w:tcW w:type="dxa" w:w="2888"/>
+            <w:tcBorders>
+              <w:top w:val="single" w:color="C9D3DF" w:sz="4"/>
+              <w:left w:val="single" w:color="C9D3DF" w:sz="4"/>
+              <w:bottom w:val="single" w:color="C9D3DF" w:sz="4"/>
+              <w:right w:val="single" w:color="C9D3DF" w:sz="4"/>
+            </w:tcBorders>
+            <w:shd w:fill="F3F4F6" w:color="auto" w:val="clear"/>
+            <w:tcMar>
+              <w:top w:type="dxa" w:w="60"/>
+              <w:left w:type="dxa" w:w="100"/>
+              <w:bottom w:type="dxa" w:w="60"/>
+              <w:right w:type="dxa" w:w="100"/>
+            </w:tcMar>
+          </w:tcPr>
+          <w:p>
+            <w:r>
+              <w:rPr>
+                <w:sz w:val="19"/>
+                <w:szCs w:val="19"/>
+              </w:rPr>
               <w:t xml:space="preserve">What is manual exception claim for?</w:t>
             </w:r>
           </w:p>
@@ -28501,6 +30182,7 @@
               <w:bottom w:val="single" w:color="C9D3DF" w:sz="4"/>
               <w:right w:val="single" w:color="C9D3DF" w:sz="4"/>
             </w:tcBorders>
+            <w:shd w:fill="F3F4F6" w:color="auto" w:val="clear"/>
             <w:tcMar>
               <w:top w:type="dxa" w:w="60"/>
               <w:left w:type="dxa" w:w="100"/>
@@ -28885,6 +30567,18 @@
       </w:pPr>
     </w:lvl>
   </w:abstractNum>
+  <w:abstractNum w:abstractNumId="14" w15:restartNumberingAfterBreak="0">
+    <w:multiLevelType w:val="hybridMultilevel"/>
+    <w:lvl w:ilvl="0" w:tentative="1">
+      <w:start w:val="1"/>
+      <w:numFmt w:val="decimal"/>
+      <w:lvlText w:val="%1."/>
+      <w:lvlJc w:val="left"/>
+      <w:pPr>
+        <w:ind w:left="540" w:hanging="360"/>
+      </w:pPr>
+    </w:lvl>
+  </w:abstractNum>
   <w:num w:numId="1">
     <w:abstractNumId w:val="1"/>
     <w:lvlOverride w:ilvl="0">
@@ -28959,6 +30653,12 @@
   </w:num>
   <w:num w:numId="13">
     <w:abstractNumId w:val="13"/>
+    <w:lvlOverride w:ilvl="0">
+      <w:startOverride w:val="1"/>
+    </w:lvlOverride>
+  </w:num>
+  <w:num w:numId="14">
+    <w:abstractNumId w:val="14"/>
     <w:lvlOverride w:ilvl="0">
       <w:startOverride w:val="1"/>
     </w:lvlOverride>

</xml_diff>